<commit_message>
fix: fix the trooper data export
</commit_message>
<xml_diff>
--- a/apps/api/templates/student-enrollment-form-templ.docx
+++ b/apps/api/templates/student-enrollment-form-templ.docx
@@ -1,6 +1,6 @@
 
 <file path=word/document.xml><?xml version="1.0" encoding="utf-8"?>
-<w:document xmlns:wpc="http://schemas.microsoft.com/office/word/2010/wordprocessingCanvas" xmlns:cx="http://schemas.microsoft.com/office/drawing/2014/chartex" xmlns:cx1="http://schemas.microsoft.com/office/drawing/2015/9/8/chartex" xmlns:cx2="http://schemas.microsoft.com/office/drawing/2015/10/21/chartex" xmlns:cx3="http://schemas.microsoft.com/office/drawing/2016/5/9/chartex" xmlns:cx4="http://schemas.microsoft.com/office/drawing/2016/5/10/chartex" xmlns:cx5="http://schemas.microsoft.com/office/drawing/2016/5/11/chartex" xmlns:cx6="http://schemas.microsoft.com/office/drawing/2016/5/12/chartex" xmlns:cx7="http://schemas.microsoft.com/office/drawing/2016/5/13/chartex" xmlns:cx8="http://schemas.microsoft.com/office/drawing/2016/5/14/chartex" xmlns:mc="http://schemas.openxmlformats.org/markup-compatibility/2006" xmlns:aink="http://schemas.microsoft.com/office/drawing/2016/ink" xmlns:am3d="http://schemas.microsoft.com/office/drawing/2017/model3d" xmlns:o="urn:schemas-microsoft-com:office:office" xmlns:oel="http://schemas.microsoft.com/office/2019/extlst" xmlns:r="http://schemas.openxmlformats.org/officeDocument/2006/relationships" xmlns:m="http://schemas.openxmlformats.org/officeDocument/2006/math" xmlns:v="urn:schemas-microsoft-com:vml" xmlns:wp14="http://schemas.microsoft.com/office/word/2010/wordprocessingDrawing" xmlns:wp="http://schemas.openxmlformats.org/drawingml/2006/wordprocessingDrawing" xmlns:w10="urn:schemas-microsoft-com:office:word" xmlns:w="http://schemas.openxmlformats.org/wordprocessingml/2006/main" xmlns:w14="http://schemas.microsoft.com/office/word/2010/wordml" xmlns:w15="http://schemas.microsoft.com/office/word/2012/wordml" xmlns:w16cex="http://schemas.microsoft.com/office/word/2018/wordml/cex" xmlns:w16cid="http://schemas.microsoft.com/office/word/2016/wordml/cid" xmlns:w16="http://schemas.microsoft.com/office/word/2018/wordml" xmlns:w16du="http://schemas.microsoft.com/office/word/2023/wordml/word16du" xmlns:w16sdtdh="http://schemas.microsoft.com/office/word/2020/wordml/sdtdatahash" xmlns:w16sdtfl="http://schemas.microsoft.com/office/word/2024/wordml/sdtformatlock" xmlns:w16se="http://schemas.microsoft.com/office/word/2015/wordml/symex" xmlns:wpg="http://schemas.microsoft.com/office/word/2010/wordprocessingGroup" xmlns:wpi="http://schemas.microsoft.com/office/word/2010/wordprocessingInk" xmlns:wne="http://schemas.microsoft.com/office/word/2006/wordml" xmlns:wps="http://schemas.microsoft.com/office/word/2010/wordprocessingShape" mc:Ignorable="w14 w15 w16se w16cid w16 w16cex w16sdtdh w16sdtfl w16du wp14">
+<w:document xmlns:wpc="http://schemas.microsoft.com/office/word/2010/wordprocessingCanvas" xmlns:cx="http://schemas.microsoft.com/office/drawing/2014/chartex" xmlns:cx1="http://schemas.microsoft.com/office/drawing/2015/9/8/chartex" xmlns:cx2="http://schemas.microsoft.com/office/drawing/2015/10/21/chartex" xmlns:cx3="http://schemas.microsoft.com/office/drawing/2016/5/9/chartex" xmlns:cx4="http://schemas.microsoft.com/office/drawing/2016/5/10/chartex" xmlns:cx5="http://schemas.microsoft.com/office/drawing/2016/5/11/chartex" xmlns:cx6="http://schemas.microsoft.com/office/drawing/2016/5/12/chartex" xmlns:cx7="http://schemas.microsoft.com/office/drawing/2016/5/13/chartex" xmlns:cx8="http://schemas.microsoft.com/office/drawing/2016/5/14/chartex" xmlns:mc="http://schemas.openxmlformats.org/markup-compatibility/2006" xmlns:aink="http://schemas.microsoft.com/office/drawing/2016/ink" xmlns:am3d="http://schemas.microsoft.com/office/drawing/2017/model3d" xmlns:o="urn:schemas-microsoft-com:office:office" xmlns:r="http://schemas.openxmlformats.org/officeDocument/2006/relationships" xmlns:m="http://schemas.openxmlformats.org/officeDocument/2006/math" xmlns:v="urn:schemas-microsoft-com:vml" xmlns:wp14="http://schemas.microsoft.com/office/word/2010/wordprocessingDrawing" xmlns:wp="http://schemas.openxmlformats.org/drawingml/2006/wordprocessingDrawing" xmlns:w10="urn:schemas-microsoft-com:office:word" xmlns:w="http://schemas.openxmlformats.org/wordprocessingml/2006/main" xmlns:w14="http://schemas.microsoft.com/office/word/2010/wordml" xmlns:w15="http://schemas.microsoft.com/office/word/2012/wordml" xmlns:w16cid="http://schemas.microsoft.com/office/word/2016/wordml/cid" xmlns:w16se="http://schemas.microsoft.com/office/word/2015/wordml/symex" xmlns:wpg="http://schemas.microsoft.com/office/word/2010/wordprocessingGroup" xmlns:wpi="http://schemas.microsoft.com/office/word/2010/wordprocessingInk" xmlns:wne="http://schemas.microsoft.com/office/word/2006/wordml" xmlns:wps="http://schemas.microsoft.com/office/word/2010/wordprocessingShape" mc:Ignorable="w14 w15 w16se w16cid wp14">
   <w:body>
     <w:p>
       <w:pPr>
@@ -35,7 +35,12 @@
           <w:rFonts w:ascii="Times New Roman" w:hAnsi="Times New Roman" w:cs="Times New Roman"/>
         </w:rPr>
         <w:tab/>
-        <w:t>TỔNG CỤC HẬU CẦN – KỸ THUẬT</w:t>
+      </w:r>
+      <w:r>
+        <w:rPr>
+          <w:rFonts w:ascii="Times New Roman" w:hAnsi="Times New Roman" w:cs="Times New Roman"/>
+        </w:rPr>
+        <w:t>{unit.parentName}</w:t>
       </w:r>
       <w:r>
         <w:rPr>
@@ -64,7 +69,13 @@
           <w:b/>
         </w:rPr>
         <w:tab/>
-        <w:t>TRƯỜNG CAO ĐẲNG HẬU CẦN 2</w:t>
+      </w:r>
+      <w:r>
+        <w:rPr>
+          <w:rFonts w:ascii="Times New Roman" w:hAnsi="Times New Roman" w:cs="Times New Roman"/>
+          <w:b/>
+        </w:rPr>
+        <w:t>{unit.name}</w:t>
       </w:r>
       <w:r>
         <w:rPr>
@@ -194,7 +205,21 @@
                                 <w:sz w:val="24"/>
                                 <w:szCs w:val="24"/>
                               </w:rPr>
-                              <w:t>Mã số học viên:</w:t>
+                              <w:t xml:space="preserve">Mã số </w:t>
+                            </w:r>
+                            <w:r>
+                              <w:rPr>
+                                <w:sz w:val="24"/>
+                                <w:szCs w:val="24"/>
+                              </w:rPr>
+                              <w:t>quân nhâ</w:t>
+                            </w:r>
+                            <w:r>
+                              <w:rPr>
+                                <w:sz w:val="24"/>
+                                <w:szCs w:val="24"/>
+                              </w:rPr>
+                              <w:t>n:</w:t>
                             </w:r>
                             <w:r>
                               <w:rPr>
@@ -228,7 +253,7 @@
                 <v:stroke joinstyle="miter"/>
                 <v:path gradientshapeok="t" o:connecttype="rect"/>
               </v:shapetype>
-              <v:shape id="Text Box 1" o:spid="_x0000_s1026" type="#_x0000_t202" style="position:absolute;left:0;text-align:left;margin-left:27.95pt;margin-top:8.55pt;width:182pt;height:27.8pt;z-index:251643904;visibility:visible;mso-wrap-style:square;mso-wrap-distance-left:9pt;mso-wrap-distance-top:0;mso-wrap-distance-right:9pt;mso-wrap-distance-bottom:0;mso-position-horizontal:absolute;mso-position-horizontal-relative:text;mso-position-vertical:absolute;mso-position-vertical-relative:text;v-text-anchor:top" o:gfxdata="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" filled="f" stroked="f">
+              <v:shape id="Text Box 1" o:spid="_x0000_s1026" type="#_x0000_t202" style="position:absolute;left:0;text-align:left;margin-left:27.95pt;margin-top:8.55pt;width:182pt;height:27.8pt;z-index:251643904;visibility:visible;mso-wrap-style:square;mso-wrap-distance-left:9pt;mso-wrap-distance-top:0;mso-wrap-distance-right:9pt;mso-wrap-distance-bottom:0;mso-position-horizontal:absolute;mso-position-horizontal-relative:text;mso-position-vertical:absolute;mso-position-vertical-relative:text;v-text-anchor:top" o:gfxdata="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" filled="f" stroked="f">
                 <v:stroke dashstyle="1 1" endcap="round"/>
                 <v:textbox>
                   <w:txbxContent>
@@ -252,7 +277,21 @@
                           <w:sz w:val="24"/>
                           <w:szCs w:val="24"/>
                         </w:rPr>
-                        <w:t>Mã số học viên:</w:t>
+                        <w:t xml:space="preserve">Mã số </w:t>
+                      </w:r>
+                      <w:r>
+                        <w:rPr>
+                          <w:sz w:val="24"/>
+                          <w:szCs w:val="24"/>
+                        </w:rPr>
+                        <w:t>quân nhâ</w:t>
+                      </w:r>
+                      <w:r>
+                        <w:rPr>
+                          <w:sz w:val="24"/>
+                          <w:szCs w:val="24"/>
+                        </w:rPr>
+                        <w:t>n:</w:t>
                       </w:r>
                       <w:r>
                         <w:rPr>
@@ -294,7 +333,27 @@
           <w:szCs w:val="24"/>
         </w:rPr>
         <w:tab/>
-        <w:t xml:space="preserve">                Tp. Hồ Chí Minh, ngày {day} tháng {month} năm {year}</w:t>
+        <w:t xml:space="preserve">                </w:t>
+      </w:r>
+      <w:r>
+        <w:rPr>
+          <w:rFonts w:ascii="Times New Roman" w:hAnsi="Times New Roman" w:cs="Times New Roman"/>
+          <w:i/>
+          <w:sz w:val="24"/>
+          <w:szCs w:val="24"/>
+        </w:rPr>
+        <w:t>{city}</w:t>
+      </w:r>
+      <w:bookmarkStart w:id="0" w:name="_GoBack"/>
+      <w:bookmarkEnd w:id="0"/>
+      <w:r>
+        <w:rPr>
+          <w:rFonts w:ascii="Times New Roman" w:hAnsi="Times New Roman" w:cs="Times New Roman"/>
+          <w:i/>
+          <w:sz w:val="24"/>
+          <w:szCs w:val="24"/>
+        </w:rPr>
+        <w:t>, ngày {day} tháng {month} năm {year}</w:t>
       </w:r>
     </w:p>
     <w:p>
@@ -315,7 +374,7 @@
           <w:sz w:val="38"/>
           <w:szCs w:val="28"/>
         </w:rPr>
-        <w:t>PHIẾU HỌC VIÊN</w:t>
+        <w:t>TRÍCH NGANG QUÂN NHÂN</w:t>
       </w:r>
     </w:p>
     <w:p>
@@ -344,6 +403,7 @@
       <w:r>
         <w:rPr>
           <w:noProof/>
+          <w:color w:val="FFFFFF" w:themeColor="background1"/>
         </w:rPr>
         <mc:AlternateContent>
           <mc:Choice Requires="wps">
@@ -433,11 +493,7 @@
           </mc:Choice>
           <mc:Fallback>
             <w:pict>
-              <v:shapetype w14:anchorId="58391D37" id="_x0000_t202" coordsize="21600,21600" o:spt="202" path="m,l,21600r21600,l21600,xe">
-                <v:stroke joinstyle="miter"/>
-                <v:path gradientshapeok="t" o:connecttype="rect"/>
-              </v:shapetype>
-              <v:shape id="Text Box 34" o:spid="_x0000_s1027" type="#_x0000_t202" style="position:absolute;left:0;text-align:left;margin-left:21.5pt;margin-top:139.3pt;width:101.95pt;height:128.2pt;z-index:251677696;visibility:visible;mso-wrap-style:square;mso-width-percent:0;mso-height-percent:0;mso-wrap-distance-left:9pt;mso-wrap-distance-top:0;mso-wrap-distance-right:9pt;mso-wrap-distance-bottom:0;mso-position-horizontal:absolute;mso-position-horizontal-relative:text;mso-position-vertical:absolute;mso-position-vertical-relative:page;mso-width-percent:0;mso-height-percent:0;mso-width-relative:margin;mso-height-relative:margin;v-text-anchor:top" o:gfxdata="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" fillcolor="white [3201]" strokeweight=".5pt">
+              <v:shape w14:anchorId="58391D37" id="Text Box 34" o:spid="_x0000_s1027" type="#_x0000_t202" style="position:absolute;left:0;text-align:left;margin-left:21.5pt;margin-top:139.3pt;width:101.95pt;height:128.2pt;z-index:251677696;visibility:visible;mso-wrap-style:square;mso-width-percent:0;mso-height-percent:0;mso-wrap-distance-left:9pt;mso-wrap-distance-top:0;mso-wrap-distance-right:9pt;mso-wrap-distance-bottom:0;mso-position-horizontal:absolute;mso-position-horizontal-relative:text;mso-position-vertical:absolute;mso-position-vertical-relative:page;mso-width-percent:0;mso-height-percent:0;mso-width-relative:margin;mso-height-relative:margin;v-text-anchor:top" o:gfxdata="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" fillcolor="white [3201]" strokeweight=".5pt">
                 <v:textbox>
                   <w:txbxContent>
                     <w:p>
@@ -480,6 +536,7 @@
         <w:rPr>
           <w:rFonts w:ascii="Times New Roman" w:hAnsi="Times New Roman" w:cs="Times New Roman"/>
           <w:noProof/>
+          <w:color w:val="FFFFFF" w:themeColor="background1"/>
           <w:sz w:val="28"/>
           <w:szCs w:val="28"/>
         </w:rPr>
@@ -564,7 +621,7 @@
           </mc:Choice>
           <mc:Fallback>
             <w:pict>
-              <v:shape w14:anchorId="1EB40180" id="Text Box 56" o:spid="_x0000_s1028" type="#_x0000_t202" style="position:absolute;left:0;text-align:left;margin-left:170.75pt;margin-top:74.55pt;width:256.8pt;height:28.05pt;z-index:251645952;visibility:visible;mso-wrap-style:square;mso-width-percent:0;mso-wrap-distance-left:9pt;mso-wrap-distance-top:0;mso-wrap-distance-right:9pt;mso-wrap-distance-bottom:0;mso-position-horizontal:absolute;mso-position-horizontal-relative:text;mso-position-vertical:absolute;mso-position-vertical-relative:text;mso-width-percent:0;mso-width-relative:margin;v-text-anchor:top" o:gfxdata="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" filled="f" stroked="f">
+              <v:shape w14:anchorId="1EB40180" id="Text Box 56" o:spid="_x0000_s1028" type="#_x0000_t202" style="position:absolute;left:0;text-align:left;margin-left:170.75pt;margin-top:74.55pt;width:256.8pt;height:28.05pt;z-index:251645952;visibility:visible;mso-wrap-style:square;mso-width-percent:0;mso-wrap-distance-left:9pt;mso-wrap-distance-top:0;mso-wrap-distance-right:9pt;mso-wrap-distance-bottom:0;mso-position-horizontal:absolute;mso-position-horizontal-relative:text;mso-position-vertical:absolute;mso-position-vertical-relative:text;mso-width-percent:0;mso-width-relative:margin;v-text-anchor:top" o:gfxdata="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" filled="f" stroked="f">
                 <v:textbox>
                   <w:txbxContent>
                     <w:p>
@@ -604,6 +661,7 @@
       <w:r>
         <w:rPr>
           <w:rFonts w:ascii="Times New Roman" w:hAnsi="Times New Roman" w:cs="Times New Roman"/>
+          <w:color w:val="FFFFFF" w:themeColor="background1"/>
           <w:sz w:val="28"/>
           <w:szCs w:val="28"/>
         </w:rPr>
@@ -612,6 +670,7 @@
       <w:r>
         <w:rPr>
           <w:rFonts w:ascii="Times New Roman" w:hAnsi="Times New Roman" w:cs="Times New Roman"/>
+          <w:color w:val="FFFFFF" w:themeColor="background1"/>
           <w:sz w:val="28"/>
           <w:szCs w:val="28"/>
         </w:rPr>
@@ -620,6 +679,7 @@
       <w:r>
         <w:rPr>
           <w:rFonts w:ascii="Times New Roman" w:hAnsi="Times New Roman" w:cs="Times New Roman"/>
+          <w:color w:val="FFFFFF" w:themeColor="background1"/>
           <w:sz w:val="28"/>
           <w:szCs w:val="28"/>
         </w:rPr>
@@ -630,6 +690,7 @@
           <w:rFonts w:ascii="Times New Roman" w:hAnsi="Times New Roman" w:cs="Times New Roman"/>
           <w:b/>
           <w:noProof/>
+          <w:color w:val="FFFFFF" w:themeColor="background1"/>
           <w:sz w:val="28"/>
           <w:szCs w:val="28"/>
         </w:rPr>
@@ -675,13 +736,19 @@
                       <wps:txbx>
                         <w:txbxContent>
                           <w:p>
+                            <w:pPr>
+                              <w:rPr>
+                                <w:color w:val="FFFFFF" w:themeColor="background1"/>
+                              </w:rPr>
+                            </w:pPr>
                             <w:r>
                               <w:rPr>
                                 <w:rFonts w:ascii="Times New Roman" w:hAnsi="Times New Roman" w:cs="Times New Roman"/>
+                                <w:color w:val="FFFFFF" w:themeColor="background1"/>
                                 <w:sz w:val="28"/>
                                 <w:szCs w:val="28"/>
                               </w:rPr>
-                              <w:t xml:space="preserve">{stu.class.name}                    </w:t>
+                              <w:t xml:space="preserve">{stu.class ? stu.class.name : ''}                    </w:t>
                             </w:r>
                           </w:p>
                         </w:txbxContent>
@@ -697,17 +764,23 @@
           </mc:Choice>
           <mc:Fallback>
             <w:pict>
-              <v:shape w14:anchorId="1CA773C4" id="Text Box 55" o:spid="_x0000_s1029" type="#_x0000_t202" style="position:absolute;left:0;text-align:left;margin-left:157.75pt;margin-top:-5.8pt;width:148.25pt;height:28.05pt;z-index:-251639808;visibility:visible;mso-wrap-style:square;mso-wrap-distance-left:9pt;mso-wrap-distance-top:0;mso-wrap-distance-right:9pt;mso-wrap-distance-bottom:0;mso-position-horizontal:absolute;mso-position-horizontal-relative:text;mso-position-vertical:absolute;mso-position-vertical-relative:text;v-text-anchor:top" o:gfxdata="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" stroked="f">
+              <v:shape w14:anchorId="1CA773C4" id="Text Box 55" o:spid="_x0000_s1029" type="#_x0000_t202" style="position:absolute;left:0;text-align:left;margin-left:157.75pt;margin-top:-5.8pt;width:148.25pt;height:28.05pt;z-index:-251639808;visibility:visible;mso-wrap-style:square;mso-wrap-distance-left:9pt;mso-wrap-distance-top:0;mso-wrap-distance-right:9pt;mso-wrap-distance-bottom:0;mso-position-horizontal:absolute;mso-position-horizontal-relative:text;mso-position-vertical:absolute;mso-position-vertical-relative:text;v-text-anchor:top" o:gfxdata="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" stroked="f">
                 <v:textbox>
                   <w:txbxContent>
                     <w:p>
+                      <w:pPr>
+                        <w:rPr>
+                          <w:color w:val="FFFFFF" w:themeColor="background1"/>
+                        </w:rPr>
+                      </w:pPr>
                       <w:r>
                         <w:rPr>
                           <w:rFonts w:ascii="Times New Roman" w:hAnsi="Times New Roman" w:cs="Times New Roman"/>
+                          <w:color w:val="FFFFFF" w:themeColor="background1"/>
                           <w:sz w:val="28"/>
                           <w:szCs w:val="28"/>
                         </w:rPr>
-                        <w:t xml:space="preserve">{stu.class.name}                    </w:t>
+                        <w:t xml:space="preserve">{stu.class ? stu.class.name : ''}                    </w:t>
                       </w:r>
                     </w:p>
                   </w:txbxContent>
@@ -721,6 +794,7 @@
       <w:r>
         <w:rPr>
           <w:rFonts w:ascii="Times New Roman" w:hAnsi="Times New Roman" w:cs="Times New Roman"/>
+          <w:color w:val="FFFFFF" w:themeColor="background1"/>
           <w:sz w:val="28"/>
           <w:szCs w:val="28"/>
         </w:rPr>
@@ -772,6 +846,13 @@
           <w:szCs w:val="28"/>
         </w:rPr>
         <w:tab/>
+      </w:r>
+      <w:r>
+        <w:rPr>
+          <w:rFonts w:ascii="Times New Roman" w:hAnsi="Times New Roman" w:cs="Times New Roman"/>
+          <w:sz w:val="28"/>
+          <w:szCs w:val="28"/>
+        </w:rPr>
         <w:t>Nam□, Nữ □</w:t>
       </w:r>
     </w:p>
@@ -857,7 +938,7 @@
           </mc:Choice>
           <mc:Fallback>
             <w:pict>
-              <v:shape w14:anchorId="71CB7CA4" id="Text Box 57" o:spid="_x0000_s1030" type="#_x0000_t202" style="position:absolute;left:0;text-align:left;margin-left:96.35pt;margin-top:-5.15pt;width:118.5pt;height:28.05pt;z-index:251646976;visibility:visible;mso-wrap-style:square;mso-wrap-distance-left:9pt;mso-wrap-distance-top:0;mso-wrap-distance-right:9pt;mso-wrap-distance-bottom:0;mso-position-horizontal:absolute;mso-position-horizontal-relative:text;mso-position-vertical:absolute;mso-position-vertical-relative:text;v-text-anchor:top" o:gfxdata="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" filled="f" stroked="f">
+              <v:shape w14:anchorId="71CB7CA4" id="Text Box 57" o:spid="_x0000_s1030" type="#_x0000_t202" style="position:absolute;left:0;text-align:left;margin-left:96.35pt;margin-top:-5.15pt;width:118.5pt;height:28.05pt;z-index:251646976;visibility:visible;mso-wrap-style:square;mso-wrap-distance-left:9pt;mso-wrap-distance-top:0;mso-wrap-distance-right:9pt;mso-wrap-distance-bottom:0;mso-position-horizontal:absolute;mso-position-horizontal-relative:text;mso-position-vertical:absolute;mso-position-vertical-relative:text;v-text-anchor:top" o:gfxdata="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" filled="f" stroked="f">
                 <v:textbox>
                   <w:txbxContent>
                     <w:p>
@@ -950,7 +1031,7 @@
           </mc:Choice>
           <mc:Fallback>
             <w:pict>
-              <v:shape w14:anchorId="23E5028B" id="Text Box 59" o:spid="_x0000_s1031" type="#_x0000_t202" style="position:absolute;left:0;text-align:left;margin-left:264.25pt;margin-top:-5.55pt;width:252.7pt;height:28.05pt;z-index:251648000;visibility:visible;mso-wrap-style:square;mso-width-percent:0;mso-wrap-distance-left:9pt;mso-wrap-distance-top:0;mso-wrap-distance-right:9pt;mso-wrap-distance-bottom:0;mso-position-horizontal:absolute;mso-position-horizontal-relative:text;mso-position-vertical:absolute;mso-position-vertical-relative:text;mso-width-percent:0;mso-width-relative:margin;v-text-anchor:top" o:gfxdata="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" filled="f" stroked="f">
+              <v:shape w14:anchorId="23E5028B" id="Text Box 59" o:spid="_x0000_s1031" type="#_x0000_t202" style="position:absolute;left:0;text-align:left;margin-left:264.25pt;margin-top:-5.55pt;width:252.7pt;height:28.05pt;z-index:251648000;visibility:visible;mso-wrap-style:square;mso-width-percent:0;mso-wrap-distance-left:9pt;mso-wrap-distance-top:0;mso-wrap-distance-right:9pt;mso-wrap-distance-bottom:0;mso-position-horizontal:absolute;mso-position-horizontal-relative:text;mso-position-vertical:absolute;mso-position-vertical-relative:text;mso-width-percent:0;mso-width-relative:margin;v-text-anchor:top" o:gfxdata="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" filled="f" stroked="f">
                 <v:textbox>
                   <w:txbxContent>
                     <w:p>
@@ -1071,7 +1152,7 @@
           </mc:Choice>
           <mc:Fallback>
             <w:pict>
-              <v:shape w14:anchorId="308A556E" id="Text Box 61" o:spid="_x0000_s1032" type="#_x0000_t202" style="position:absolute;left:0;text-align:left;margin-left:88.2pt;margin-top:-5.8pt;width:120.75pt;height:28.05pt;z-index:251649024;visibility:visible;mso-wrap-style:square;mso-wrap-distance-left:9pt;mso-wrap-distance-top:0;mso-wrap-distance-right:9pt;mso-wrap-distance-bottom:0;mso-position-horizontal:absolute;mso-position-horizontal-relative:text;mso-position-vertical:absolute;mso-position-vertical-relative:text;v-text-anchor:top" o:gfxdata="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" filled="f" stroked="f">
+              <v:shape w14:anchorId="308A556E" id="Text Box 61" o:spid="_x0000_s1032" type="#_x0000_t202" style="position:absolute;left:0;text-align:left;margin-left:88.2pt;margin-top:-5.8pt;width:120.75pt;height:28.05pt;z-index:251649024;visibility:visible;mso-wrap-style:square;mso-wrap-distance-left:9pt;mso-wrap-distance-top:0;mso-wrap-distance-right:9pt;mso-wrap-distance-bottom:0;mso-position-horizontal:absolute;mso-position-horizontal-relative:text;mso-position-vertical:absolute;mso-position-vertical-relative:text;v-text-anchor:top" o:gfxdata="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" filled="f" stroked="f">
                 <v:textbox>
                   <w:txbxContent>
                     <w:p>
@@ -1164,7 +1245,7 @@
           </mc:Choice>
           <mc:Fallback>
             <w:pict>
-              <v:shape w14:anchorId="776A8CAB" id="Text Box 62" o:spid="_x0000_s1033" type="#_x0000_t202" style="position:absolute;left:0;text-align:left;margin-left:268.9pt;margin-top:317.9pt;width:165.45pt;height:28.05pt;z-index:251650048;visibility:visible;mso-wrap-style:square;mso-width-percent:0;mso-wrap-distance-left:9pt;mso-wrap-distance-top:0;mso-wrap-distance-right:9pt;mso-wrap-distance-bottom:0;mso-position-horizontal:absolute;mso-position-horizontal-relative:text;mso-position-vertical:absolute;mso-position-vertical-relative:page;mso-width-percent:0;mso-width-relative:margin;v-text-anchor:top" o:gfxdata="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" filled="f" stroked="f">
+              <v:shape w14:anchorId="776A8CAB" id="Text Box 62" o:spid="_x0000_s1033" type="#_x0000_t202" style="position:absolute;left:0;text-align:left;margin-left:268.9pt;margin-top:317.9pt;width:165.45pt;height:28.05pt;z-index:251650048;visibility:visible;mso-wrap-style:square;mso-width-percent:0;mso-wrap-distance-left:9pt;mso-wrap-distance-top:0;mso-wrap-distance-right:9pt;mso-wrap-distance-bottom:0;mso-position-horizontal:absolute;mso-position-horizontal-relative:text;mso-position-vertical:absolute;mso-position-vertical-relative:page;mso-width-percent:0;mso-width-relative:margin;v-text-anchor:top" o:gfxdata="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" filled="f" stroked="f">
                 <v:textbox>
                   <w:txbxContent>
                     <w:p>
@@ -1225,13 +1306,13 @@
         <mc:AlternateContent>
           <mc:Choice Requires="wps">
             <w:drawing>
-              <wp:anchor distT="0" distB="0" distL="114300" distR="114300" simplePos="0" relativeHeight="251651072" behindDoc="0" locked="1" layoutInCell="1" allowOverlap="1" wp14:anchorId="12727EA9" wp14:editId="4AAD1B56">
+              <wp:anchor distT="0" distB="0" distL="114300" distR="114300" simplePos="0" relativeHeight="251651072" behindDoc="0" locked="1" layoutInCell="1" allowOverlap="1" wp14:anchorId="12727EA9" wp14:editId="4C52108C">
                 <wp:simplePos x="0" y="0"/>
-                <wp:positionH relativeFrom="column">
-                  <wp:posOffset>1947545</wp:posOffset>
+                <wp:positionH relativeFrom="margin">
+                  <wp:align>center</wp:align>
                 </wp:positionH>
                 <wp:positionV relativeFrom="paragraph">
-                  <wp:posOffset>-69850</wp:posOffset>
+                  <wp:posOffset>-107950</wp:posOffset>
                 </wp:positionV>
                 <wp:extent cx="4618990" cy="356235"/>
                 <wp:effectExtent l="0" t="0" r="0" b="5715"/>
@@ -1267,7 +1348,7 @@
                                 <w:sz w:val="28"/>
                                 <w:szCs w:val="28"/>
                               </w:rPr>
-                              <w:t>Lớp {stu.class.name}, {companyName}, {batalionName}</w:t>
+                              <w:t xml:space="preserve"> {stu.donVi}</w:t>
                             </w:r>
                           </w:p>
                         </w:txbxContent>
@@ -1283,7 +1364,7 @@
           </mc:Choice>
           <mc:Fallback>
             <w:pict>
-              <v:shape w14:anchorId="12727EA9" id="Text Box 63" o:spid="_x0000_s1034" type="#_x0000_t202" style="position:absolute;left:0;text-align:left;margin-left:153.35pt;margin-top:-5.5pt;width:363.7pt;height:28.05pt;z-index:251651072;visibility:visible;mso-wrap-style:square;mso-wrap-distance-left:9pt;mso-wrap-distance-top:0;mso-wrap-distance-right:9pt;mso-wrap-distance-bottom:0;mso-position-horizontal:absolute;mso-position-horizontal-relative:text;mso-position-vertical:absolute;mso-position-vertical-relative:text;v-text-anchor:top" o:gfxdata="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" filled="f" stroked="f">
+              <v:shape w14:anchorId="12727EA9" id="Text Box 63" o:spid="_x0000_s1034" type="#_x0000_t202" style="position:absolute;left:0;text-align:left;margin-left:0;margin-top:-8.5pt;width:363.7pt;height:28.05pt;z-index:251651072;visibility:visible;mso-wrap-style:square;mso-wrap-distance-left:9pt;mso-wrap-distance-top:0;mso-wrap-distance-right:9pt;mso-wrap-distance-bottom:0;mso-position-horizontal:center;mso-position-horizontal-relative:margin;mso-position-vertical:absolute;mso-position-vertical-relative:text;v-text-anchor:top" o:gfxdata="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" filled="f" stroked="f">
                 <v:textbox>
                   <w:txbxContent>
                     <w:p>
@@ -1292,11 +1373,12 @@
                           <w:sz w:val="28"/>
                           <w:szCs w:val="28"/>
                         </w:rPr>
-                        <w:t>Lớp {stu.class.name}, {companyName}, {batalionName}</w:t>
+                        <w:t xml:space="preserve"> {stu.donVi}</w:t>
                       </w:r>
                     </w:p>
                   </w:txbxContent>
                 </v:textbox>
+                <w10:wrap anchorx="margin"/>
                 <w10:anchorlock/>
               </v:shape>
             </w:pict>
@@ -1309,14 +1391,14 @@
           <w:sz w:val="28"/>
           <w:szCs w:val="28"/>
         </w:rPr>
-        <w:t>Đơn vị: Ti</w:t>
-      </w:r>
-      <w:r>
-        <w:rPr>
-          <w:sz w:val="28"/>
-          <w:szCs w:val="28"/>
-        </w:rPr>
-        <w:t xml:space="preserve">ểu  đội: </w:t>
+        <w:t>Đơn vị:</w:t>
+      </w:r>
+      <w:r>
+        <w:rPr>
+          <w:sz w:val="28"/>
+          <w:szCs w:val="28"/>
+        </w:rPr>
+        <w:t xml:space="preserve"> </w:t>
       </w:r>
       <w:r>
         <w:rPr>
@@ -1331,7 +1413,7 @@
           <w:sz w:val="28"/>
           <w:szCs w:val="28"/>
         </w:rPr>
-        <w:t>,…………………………………………………………………...</w:t>
+        <w:t>…………………………………………………………………...</w:t>
       </w:r>
     </w:p>
     <w:p>
@@ -1396,7 +1478,7 @@
                                 <w:szCs w:val="24"/>
                               </w:rPr>
                             </w:pPr>
-                            <w:bookmarkStart w:id="0" w:name="_Hlk210505767"/>
+                            <w:bookmarkStart w:id="1" w:name="_Hlk210505767"/>
                             <w:r>
                               <w:rPr>
                                 <w:rFonts w:ascii="Times New Roman" w:hAnsi="Times New Roman" w:cs="Times New Roman"/>
@@ -1405,7 +1487,7 @@
                               </w:rPr>
                               <w:t>{stu.birthPlace}</w:t>
                             </w:r>
-                            <w:bookmarkEnd w:id="0"/>
+                            <w:bookmarkEnd w:id="1"/>
                           </w:p>
                         </w:txbxContent>
                       </wps:txbx>
@@ -1423,7 +1505,7 @@
           </mc:Choice>
           <mc:Fallback>
             <w:pict>
-              <v:shape w14:anchorId="2300EAD9" id="Text Box 64" o:spid="_x0000_s1035" type="#_x0000_t202" style="position:absolute;left:0;text-align:left;margin-left:99.65pt;margin-top:-5.3pt;width:424.95pt;height:28.05pt;z-index:251652096;visibility:visible;mso-wrap-style:square;mso-width-percent:0;mso-wrap-distance-left:9pt;mso-wrap-distance-top:0;mso-wrap-distance-right:9pt;mso-wrap-distance-bottom:0;mso-position-horizontal:absolute;mso-position-horizontal-relative:text;mso-position-vertical:absolute;mso-position-vertical-relative:text;mso-width-percent:0;mso-width-relative:margin;v-text-anchor:top" o:gfxdata="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" filled="f" stroked="f">
+              <v:shape w14:anchorId="2300EAD9" id="Text Box 64" o:spid="_x0000_s1035" type="#_x0000_t202" style="position:absolute;left:0;text-align:left;margin-left:99.65pt;margin-top:-5.3pt;width:424.95pt;height:28.05pt;z-index:251652096;visibility:visible;mso-wrap-style:square;mso-width-percent:0;mso-wrap-distance-left:9pt;mso-wrap-distance-top:0;mso-wrap-distance-right:9pt;mso-wrap-distance-bottom:0;mso-position-horizontal:absolute;mso-position-horizontal-relative:text;mso-position-vertical:absolute;mso-position-vertical-relative:text;mso-width-percent:0;mso-width-relative:margin;v-text-anchor:top" o:gfxdata="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" filled="f" stroked="f">
                 <v:textbox>
                   <w:txbxContent>
                     <w:p>
@@ -1433,7 +1515,7 @@
                           <w:szCs w:val="24"/>
                         </w:rPr>
                       </w:pPr>
-                      <w:bookmarkStart w:id="1" w:name="_Hlk210505767"/>
+                      <w:bookmarkStart w:id="2" w:name="_Hlk210505767"/>
                       <w:r>
                         <w:rPr>
                           <w:rFonts w:ascii="Times New Roman" w:hAnsi="Times New Roman" w:cs="Times New Roman"/>
@@ -1442,7 +1524,7 @@
                         </w:rPr>
                         <w:t>{stu.birthPlace}</w:t>
                       </w:r>
-                      <w:bookmarkEnd w:id="1"/>
+                      <w:bookmarkEnd w:id="2"/>
                     </w:p>
                   </w:txbxContent>
                 </v:textbox>
@@ -1590,7 +1672,7 @@
           </mc:Choice>
           <mc:Fallback>
             <w:pict>
-              <v:shape w14:anchorId="7226F9A6" id="Text Box 65" o:spid="_x0000_s1036" type="#_x0000_t202" style="position:absolute;left:0;text-align:left;margin-left:28.65pt;margin-top:-5.25pt;width:488.4pt;height:28.05pt;z-index:251653120;visibility:visible;mso-wrap-style:square;mso-wrap-distance-left:9pt;mso-wrap-distance-top:0;mso-wrap-distance-right:9pt;mso-wrap-distance-bottom:0;mso-position-horizontal:absolute;mso-position-horizontal-relative:text;mso-position-vertical:absolute;mso-position-vertical-relative:text;v-text-anchor:top" o:gfxdata="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" filled="f" stroked="f">
+              <v:shape w14:anchorId="7226F9A6" id="Text Box 65" o:spid="_x0000_s1036" type="#_x0000_t202" style="position:absolute;left:0;text-align:left;margin-left:28.65pt;margin-top:-5.25pt;width:488.4pt;height:28.05pt;z-index:251653120;visibility:visible;mso-wrap-style:square;mso-wrap-distance-left:9pt;mso-wrap-distance-top:0;mso-wrap-distance-right:9pt;mso-wrap-distance-bottom:0;mso-position-horizontal:absolute;mso-position-horizontal-relative:text;mso-position-vertical:absolute;mso-position-vertical-relative:text;v-text-anchor:top" o:gfxdata="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" filled="f" stroked="f">
                 <v:textbox>
                   <w:txbxContent>
                     <w:p>
@@ -1713,7 +1795,7 @@
           </mc:Choice>
           <mc:Fallback>
             <w:pict>
-              <v:shape w14:anchorId="437D3A64" id="Text Box 66" o:spid="_x0000_s1037" type="#_x0000_t202" style="position:absolute;left:0;text-align:left;margin-left:84.05pt;margin-top:-5.7pt;width:166.55pt;height:28.05pt;z-index:251654144;visibility:visible;mso-wrap-style:square;mso-width-percent:0;mso-wrap-distance-left:9pt;mso-wrap-distance-top:0;mso-wrap-distance-right:9pt;mso-wrap-distance-bottom:0;mso-position-horizontal:absolute;mso-position-horizontal-relative:text;mso-position-vertical:absolute;mso-position-vertical-relative:text;mso-width-percent:0;mso-width-relative:margin;v-text-anchor:top" o:gfxdata="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" filled="f" stroked="f">
+              <v:shape w14:anchorId="437D3A64" id="Text Box 66" o:spid="_x0000_s1037" type="#_x0000_t202" style="position:absolute;left:0;text-align:left;margin-left:84.05pt;margin-top:-5.7pt;width:166.55pt;height:28.05pt;z-index:251654144;visibility:visible;mso-wrap-style:square;mso-width-percent:0;mso-wrap-distance-left:9pt;mso-wrap-distance-top:0;mso-wrap-distance-right:9pt;mso-wrap-distance-bottom:0;mso-position-horizontal:absolute;mso-position-horizontal-relative:text;mso-position-vertical:absolute;mso-position-vertical-relative:text;mso-width-percent:0;mso-width-relative:margin;v-text-anchor:top" o:gfxdata="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" filled="f" stroked="f">
                 <v:textbox>
                   <w:txbxContent>
                     <w:p>
@@ -1806,7 +1888,7 @@
           </mc:Choice>
           <mc:Fallback>
             <w:pict>
-              <v:shape w14:anchorId="4A1ECD90" id="Text Box 67" o:spid="_x0000_s1038" type="#_x0000_t202" style="position:absolute;left:0;text-align:left;margin-left:328.8pt;margin-top:-5.3pt;width:210.75pt;height:28.05pt;z-index:251655168;visibility:visible;mso-wrap-style:square;mso-width-percent:0;mso-wrap-distance-left:9pt;mso-wrap-distance-top:0;mso-wrap-distance-right:9pt;mso-wrap-distance-bottom:0;mso-position-horizontal:absolute;mso-position-horizontal-relative:text;mso-position-vertical:absolute;mso-position-vertical-relative:text;mso-width-percent:0;mso-width-relative:margin;v-text-anchor:top" o:gfxdata="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" filled="f" stroked="f">
+              <v:shape w14:anchorId="4A1ECD90" id="Text Box 67" o:spid="_x0000_s1038" type="#_x0000_t202" style="position:absolute;left:0;text-align:left;margin-left:328.8pt;margin-top:-5.3pt;width:210.75pt;height:28.05pt;z-index:251655168;visibility:visible;mso-wrap-style:square;mso-width-percent:0;mso-wrap-distance-left:9pt;mso-wrap-distance-top:0;mso-wrap-distance-right:9pt;mso-wrap-distance-bottom:0;mso-position-horizontal:absolute;mso-position-horizontal-relative:text;mso-position-vertical:absolute;mso-position-vertical-relative:text;mso-width-percent:0;mso-width-relative:margin;v-text-anchor:top" o:gfxdata="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" filled="f" stroked="f">
                 <v:textbox>
                   <w:txbxContent>
                     <w:p>
@@ -1929,7 +2011,7 @@
           </mc:Choice>
           <mc:Fallback>
             <w:pict>
-              <v:shape w14:anchorId="780E56B4" id="Text Box 68" o:spid="_x0000_s1039" type="#_x0000_t202" style="position:absolute;left:0;text-align:left;margin-left:140.05pt;margin-top:16.15pt;width:166.55pt;height:26.85pt;z-index:251656192;visibility:visible;mso-wrap-style:square;mso-width-percent:0;mso-height-percent:0;mso-wrap-distance-left:9pt;mso-wrap-distance-top:0;mso-wrap-distance-right:9pt;mso-wrap-distance-bottom:0;mso-position-horizontal:absolute;mso-position-horizontal-relative:text;mso-position-vertical:absolute;mso-position-vertical-relative:text;mso-width-percent:0;mso-height-percent:0;mso-width-relative:margin;mso-height-relative:margin;v-text-anchor:top" o:gfxdata="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" filled="f" stroked="f">
+              <v:shape w14:anchorId="780E56B4" id="Text Box 68" o:spid="_x0000_s1039" type="#_x0000_t202" style="position:absolute;left:0;text-align:left;margin-left:140.05pt;margin-top:16.15pt;width:166.55pt;height:26.85pt;z-index:251656192;visibility:visible;mso-wrap-style:square;mso-width-percent:0;mso-height-percent:0;mso-wrap-distance-left:9pt;mso-wrap-distance-top:0;mso-wrap-distance-right:9pt;mso-wrap-distance-bottom:0;mso-position-horizontal:absolute;mso-position-horizontal-relative:text;mso-position-vertical:absolute;mso-position-vertical-relative:text;mso-width-percent:0;mso-height-percent:0;mso-width-relative:margin;mso-height-relative:margin;v-text-anchor:top" o:gfxdata="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" filled="f" stroked="f">
                 <v:textbox>
                   <w:txbxContent>
                     <w:p>
@@ -2105,7 +2187,7 @@
           </mc:Choice>
           <mc:Fallback>
             <w:pict>
-              <v:shape w14:anchorId="6A2236C1" id="Text Box 69" o:spid="_x0000_s1040" type="#_x0000_t202" style="position:absolute;left:0;text-align:left;margin-left:215.7pt;margin-top:10.35pt;width:317.55pt;height:29.2pt;z-index:251657216;visibility:visible;mso-wrap-style:square;mso-width-percent:0;mso-wrap-distance-left:9pt;mso-wrap-distance-top:0;mso-wrap-distance-right:9pt;mso-wrap-distance-bottom:0;mso-position-horizontal:absolute;mso-position-horizontal-relative:text;mso-position-vertical:absolute;mso-position-vertical-relative:text;mso-width-percent:0;mso-width-relative:margin;v-text-anchor:top" o:gfxdata="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" filled="f" stroked="f">
+              <v:shape w14:anchorId="6A2236C1" id="Text Box 69" o:spid="_x0000_s1040" type="#_x0000_t202" style="position:absolute;left:0;text-align:left;margin-left:215.7pt;margin-top:10.35pt;width:317.55pt;height:29.2pt;z-index:251657216;visibility:visible;mso-wrap-style:square;mso-width-percent:0;mso-wrap-distance-left:9pt;mso-wrap-distance-top:0;mso-wrap-distance-right:9pt;mso-wrap-distance-bottom:0;mso-position-horizontal:absolute;mso-position-horizontal-relative:text;mso-position-vertical:absolute;mso-position-vertical-relative:text;mso-width-percent:0;mso-width-relative:margin;v-text-anchor:top" o:gfxdata="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" filled="f" stroked="f">
                 <v:textbox>
                   <w:txbxContent>
                     <w:p>
@@ -2214,7 +2296,7 @@
           </mc:Choice>
           <mc:Fallback>
             <w:pict>
-              <v:shape w14:anchorId="10D45118" id="Text Box 70" o:spid="_x0000_s1041" type="#_x0000_t202" style="position:absolute;left:0;text-align:left;margin-left:273.95pt;margin-top:26.95pt;width:264.5pt;height:28.05pt;z-index:251658240;visibility:visible;mso-wrap-style:square;mso-width-percent:0;mso-wrap-distance-left:9pt;mso-wrap-distance-top:0;mso-wrap-distance-right:9pt;mso-wrap-distance-bottom:0;mso-position-horizontal:absolute;mso-position-horizontal-relative:text;mso-position-vertical:absolute;mso-position-vertical-relative:text;mso-width-percent:0;mso-width-relative:margin;v-text-anchor:top" o:gfxdata="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" filled="f" stroked="f">
+              <v:shape w14:anchorId="10D45118" id="Text Box 70" o:spid="_x0000_s1041" type="#_x0000_t202" style="position:absolute;left:0;text-align:left;margin-left:273.95pt;margin-top:26.95pt;width:264.5pt;height:28.05pt;z-index:251658240;visibility:visible;mso-wrap-style:square;mso-width-percent:0;mso-wrap-distance-left:9pt;mso-wrap-distance-top:0;mso-wrap-distance-right:9pt;mso-wrap-distance-bottom:0;mso-position-horizontal:absolute;mso-position-horizontal-relative:text;mso-position-vertical:absolute;mso-position-vertical-relative:text;mso-width-percent:0;mso-width-relative:margin;v-text-anchor:top" o:gfxdata="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" filled="f" stroked="f">
                 <v:textbox>
                   <w:txbxContent>
                     <w:p>
@@ -2331,7 +2413,15 @@
           <w:sz w:val="28"/>
           <w:szCs w:val="28"/>
         </w:rPr>
-        <w:t>Nghề nghiệp trước khi nhập ngũ: ………………………………………………………</w:t>
+        <w:t>Nghề nghiệ</w:t>
+      </w:r>
+      <w:r>
+        <w:rPr>
+          <w:rFonts w:ascii="Times New Roman" w:hAnsi="Times New Roman" w:cs="Times New Roman"/>
+          <w:sz w:val="28"/>
+          <w:szCs w:val="28"/>
+        </w:rPr>
+        <w:t>p trước khi nhập ngũ: ………………………………………………………</w:t>
       </w:r>
     </w:p>
     <w:p>
@@ -2438,7 +2528,7 @@
           </mc:Choice>
           <mc:Fallback>
             <w:pict>
-              <v:shape w14:anchorId="441E3E6D" id="Text Box 71" o:spid="_x0000_s1042" type="#_x0000_t202" style="position:absolute;left:0;text-align:left;margin-left:89.5pt;margin-top:.65pt;width:145.05pt;height:22pt;z-index:251659264;visibility:visible;mso-wrap-style:square;mso-width-percent:0;mso-height-percent:0;mso-wrap-distance-left:9pt;mso-wrap-distance-top:0;mso-wrap-distance-right:9pt;mso-wrap-distance-bottom:0;mso-position-horizontal:absolute;mso-position-horizontal-relative:text;mso-position-vertical:absolute;mso-position-vertical-relative:text;mso-width-percent:0;mso-height-percent:0;mso-width-relative:margin;mso-height-relative:margin;v-text-anchor:top" o:gfxdata="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" filled="f" stroked="f">
+              <v:shape w14:anchorId="441E3E6D" id="Text Box 71" o:spid="_x0000_s1042" type="#_x0000_t202" style="position:absolute;left:0;text-align:left;margin-left:89.5pt;margin-top:.65pt;width:145.05pt;height:22pt;z-index:251659264;visibility:visible;mso-wrap-style:square;mso-width-percent:0;mso-height-percent:0;mso-wrap-distance-left:9pt;mso-wrap-distance-top:0;mso-wrap-distance-right:9pt;mso-wrap-distance-bottom:0;mso-position-horizontal:absolute;mso-position-horizontal-relative:text;mso-position-vertical:absolute;mso-position-vertical-relative:text;mso-width-percent:0;mso-height-percent:0;mso-width-relative:margin;mso-height-relative:margin;v-text-anchor:top" o:gfxdata="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" filled="f" stroked="f">
                 <v:textbox>
                   <w:txbxContent>
                     <w:p>
@@ -2547,7 +2637,7 @@
           </mc:Choice>
           <mc:Fallback>
             <w:pict>
-              <v:shape w14:anchorId="5BB1F5CC" id="Text Box 72" o:spid="_x0000_s1043" type="#_x0000_t202" style="position:absolute;left:0;text-align:left;margin-left:243pt;margin-top:.65pt;width:226.2pt;height:28.05pt;z-index:251660288;visibility:visible;mso-wrap-style:square;mso-width-percent:0;mso-wrap-distance-left:9pt;mso-wrap-distance-top:0;mso-wrap-distance-right:9pt;mso-wrap-distance-bottom:0;mso-position-horizontal:absolute;mso-position-horizontal-relative:text;mso-position-vertical:absolute;mso-position-vertical-relative:text;mso-width-percent:0;mso-width-relative:margin;v-text-anchor:top" o:gfxdata="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" filled="f" stroked="f">
+              <v:shape w14:anchorId="5BB1F5CC" id="Text Box 72" o:spid="_x0000_s1043" type="#_x0000_t202" style="position:absolute;left:0;text-align:left;margin-left:243pt;margin-top:.65pt;width:226.2pt;height:28.05pt;z-index:251660288;visibility:visible;mso-wrap-style:square;mso-width-percent:0;mso-wrap-distance-left:9pt;mso-wrap-distance-top:0;mso-wrap-distance-right:9pt;mso-wrap-distance-bottom:0;mso-position-horizontal:absolute;mso-position-horizontal-relative:text;mso-position-vertical:absolute;mso-position-vertical-relative:text;mso-width-percent:0;mso-width-relative:margin;v-text-anchor:top" o:gfxdata="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" filled="f" stroked="f">
                 <v:textbox>
                   <w:txbxContent>
                     <w:p>
@@ -2655,7 +2745,15 @@
           <w:sz w:val="28"/>
           <w:szCs w:val="28"/>
         </w:rPr>
-        <w:t>Ngày vào Đoàn TNCS Hồ Chí Minh:</w:t>
+        <w:t>Ngày vào</w:t>
+      </w:r>
+      <w:r>
+        <w:rPr>
+          <w:rFonts w:ascii="Times New Roman" w:hAnsi="Times New Roman" w:cs="Times New Roman"/>
+          <w:sz w:val="28"/>
+          <w:szCs w:val="28"/>
+        </w:rPr>
+        <w:t xml:space="preserve"> Đoàn TNCS Hồ Chí Minh:</w:t>
       </w:r>
       <w:r>
         <w:rPr>
@@ -2791,7 +2889,7 @@
           </mc:Choice>
           <mc:Fallback>
             <w:pict>
-              <v:shape w14:anchorId="1992BF82" id="Text Box 73" o:spid="_x0000_s1044" type="#_x0000_t202" style="position:absolute;left:0;text-align:left;margin-left:100.9pt;margin-top:18.35pt;width:166.95pt;height:28.05pt;z-index:251661312;visibility:visible;mso-wrap-style:square;mso-wrap-distance-left:9pt;mso-wrap-distance-top:0;mso-wrap-distance-right:9pt;mso-wrap-distance-bottom:0;mso-position-horizontal:absolute;mso-position-horizontal-relative:text;mso-position-vertical:absolute;mso-position-vertical-relative:text;v-text-anchor:top" o:gfxdata="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" filled="f" stroked="f">
+              <v:shape w14:anchorId="1992BF82" id="Text Box 73" o:spid="_x0000_s1044" type="#_x0000_t202" style="position:absolute;left:0;text-align:left;margin-left:100.9pt;margin-top:18.35pt;width:166.95pt;height:28.05pt;z-index:251661312;visibility:visible;mso-wrap-style:square;mso-wrap-distance-left:9pt;mso-wrap-distance-top:0;mso-wrap-distance-right:9pt;mso-wrap-distance-bottom:0;mso-position-horizontal:absolute;mso-position-horizontal-relative:text;mso-position-vertical:absolute;mso-position-vertical-relative:text;v-text-anchor:top" o:gfxdata="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" filled="f" stroked="f">
                 <v:textbox>
                   <w:txbxContent>
                     <w:p>
@@ -2887,7 +2985,7 @@
           </mc:Choice>
           <mc:Fallback>
             <w:pict>
-              <v:shape w14:anchorId="2CD86AAC" id="Text Box 74" o:spid="_x0000_s1045" type="#_x0000_t202" style="position:absolute;left:0;text-align:left;margin-left:350.55pt;margin-top:18.55pt;width:182.1pt;height:28.05pt;z-index:251662336;visibility:visible;mso-wrap-style:square;mso-width-percent:0;mso-wrap-distance-left:9pt;mso-wrap-distance-top:0;mso-wrap-distance-right:9pt;mso-wrap-distance-bottom:0;mso-position-horizontal:absolute;mso-position-horizontal-relative:text;mso-position-vertical:absolute;mso-position-vertical-relative:text;mso-width-percent:0;mso-width-relative:margin;v-text-anchor:top" o:gfxdata="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" filled="f" stroked="f">
+              <v:shape w14:anchorId="2CD86AAC" id="Text Box 74" o:spid="_x0000_s1045" type="#_x0000_t202" style="position:absolute;left:0;text-align:left;margin-left:350.55pt;margin-top:18.55pt;width:182.1pt;height:28.05pt;z-index:251662336;visibility:visible;mso-wrap-style:square;mso-width-percent:0;mso-wrap-distance-left:9pt;mso-wrap-distance-top:0;mso-wrap-distance-right:9pt;mso-wrap-distance-bottom:0;mso-position-horizontal:absolute;mso-position-horizontal-relative:text;mso-position-vertical:absolute;mso-position-vertical-relative:text;mso-width-percent:0;mso-width-relative:margin;v-text-anchor:top" o:gfxdata="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" filled="f" stroked="f">
                 <v:textbox>
                   <w:txbxContent>
                     <w:p>
@@ -3047,7 +3145,7 @@
           </mc:Choice>
           <mc:Fallback>
             <w:pict>
-              <v:shape w14:anchorId="41EFAB49" id="Text Box 75" o:spid="_x0000_s1046" type="#_x0000_t202" style="position:absolute;left:0;text-align:left;margin-left:346.6pt;margin-top:17.85pt;width:188.8pt;height:28.05pt;z-index:251663360;visibility:visible;mso-wrap-style:square;mso-wrap-distance-left:9pt;mso-wrap-distance-top:0;mso-wrap-distance-right:9pt;mso-wrap-distance-bottom:0;mso-position-horizontal:absolute;mso-position-horizontal-relative:text;mso-position-vertical:absolute;mso-position-vertical-relative:text;v-text-anchor:top" o:gfxdata="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" filled="f" stroked="f">
+              <v:shape w14:anchorId="41EFAB49" id="Text Box 75" o:spid="_x0000_s1046" type="#_x0000_t202" style="position:absolute;left:0;text-align:left;margin-left:346.6pt;margin-top:17.85pt;width:188.8pt;height:28.05pt;z-index:251663360;visibility:visible;mso-wrap-style:square;mso-wrap-distance-left:9pt;mso-wrap-distance-top:0;mso-wrap-distance-right:9pt;mso-wrap-distance-bottom:0;mso-position-horizontal:absolute;mso-position-horizontal-relative:text;mso-position-vertical:absolute;mso-position-vertical-relative:text;v-text-anchor:top" o:gfxdata="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" filled="f" stroked="f">
                 <v:textbox>
                   <w:txbxContent>
                     <w:p>
@@ -3159,7 +3257,7 @@
           </mc:Choice>
           <mc:Fallback>
             <w:pict>
-              <v:shape w14:anchorId="4885C4CE" id="Text Box 76" o:spid="_x0000_s1047" type="#_x0000_t202" style="position:absolute;left:0;text-align:left;margin-left:101.25pt;margin-top:17.75pt;width:169.5pt;height:28.05pt;z-index:251664384;visibility:visible;mso-wrap-style:square;mso-wrap-distance-left:9pt;mso-wrap-distance-top:0;mso-wrap-distance-right:9pt;mso-wrap-distance-bottom:0;mso-position-horizontal:absolute;mso-position-horizontal-relative:text;mso-position-vertical:absolute;mso-position-vertical-relative:text;v-text-anchor:top" o:gfxdata="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" filled="f" stroked="f">
+              <v:shape w14:anchorId="4885C4CE" id="Text Box 76" o:spid="_x0000_s1047" type="#_x0000_t202" style="position:absolute;left:0;text-align:left;margin-left:101.25pt;margin-top:17.75pt;width:169.5pt;height:28.05pt;z-index:251664384;visibility:visible;mso-wrap-style:square;mso-wrap-distance-left:9pt;mso-wrap-distance-top:0;mso-wrap-distance-right:9pt;mso-wrap-distance-bottom:0;mso-position-horizontal:absolute;mso-position-horizontal-relative:text;mso-position-vertical:absolute;mso-position-vertical-relative:text;v-text-anchor:top" o:gfxdata="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" filled="f" stroked="f">
                 <v:textbox>
                   <w:txbxContent>
                     <w:p>
@@ -3252,7 +3350,7 @@
           </mc:Choice>
           <mc:Fallback>
             <w:pict>
-              <v:shape w14:anchorId="67EDC52E" id="Text Box 78" o:spid="_x0000_s1048" type="#_x0000_t202" style="position:absolute;left:0;text-align:left;margin-left:348.8pt;margin-top:17.05pt;width:175.1pt;height:28.05pt;z-index:251666432;visibility:visible;mso-wrap-style:square;mso-width-percent:0;mso-wrap-distance-left:9pt;mso-wrap-distance-top:0;mso-wrap-distance-right:9pt;mso-wrap-distance-bottom:0;mso-position-horizontal:absolute;mso-position-horizontal-relative:text;mso-position-vertical:absolute;mso-position-vertical-relative:text;mso-width-percent:0;mso-width-relative:margin;v-text-anchor:top" o:gfxdata="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" filled="f" stroked="f">
+              <v:shape w14:anchorId="67EDC52E" id="Text Box 78" o:spid="_x0000_s1048" type="#_x0000_t202" style="position:absolute;left:0;text-align:left;margin-left:348.8pt;margin-top:17.05pt;width:175.1pt;height:28.05pt;z-index:251666432;visibility:visible;mso-wrap-style:square;mso-width-percent:0;mso-wrap-distance-left:9pt;mso-wrap-distance-top:0;mso-wrap-distance-right:9pt;mso-wrap-distance-bottom:0;mso-position-horizontal:absolute;mso-position-horizontal-relative:text;mso-position-vertical:absolute;mso-position-vertical-relative:text;mso-width-percent:0;mso-width-relative:margin;v-text-anchor:top" o:gfxdata="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" filled="f" stroked="f">
                 <v:textbox>
                   <w:txbxContent>
                     <w:p>
@@ -3457,7 +3555,7 @@
           </mc:Choice>
           <mc:Fallback>
             <w:pict>
-              <v:shape w14:anchorId="0026B471" id="Text Box 77" o:spid="_x0000_s1049" type="#_x0000_t202" style="position:absolute;left:0;text-align:left;margin-left:345.3pt;margin-top:-6pt;width:188.75pt;height:28.05pt;z-index:-251651072;visibility:visible;mso-wrap-style:square;mso-width-percent:0;mso-height-percent:0;mso-wrap-distance-left:9pt;mso-wrap-distance-top:0;mso-wrap-distance-right:9pt;mso-wrap-distance-bottom:0;mso-position-horizontal:absolute;mso-position-horizontal-relative:text;mso-position-vertical:absolute;mso-position-vertical-relative:text;mso-width-percent:0;mso-height-percent:0;mso-width-relative:margin;mso-height-relative:margin;v-text-anchor:top" o:gfxdata="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" filled="f" stroked="f">
+              <v:shape w14:anchorId="0026B471" id="Text Box 77" o:spid="_x0000_s1049" type="#_x0000_t202" style="position:absolute;left:0;text-align:left;margin-left:345.3pt;margin-top:-6pt;width:188.75pt;height:28.05pt;z-index:-251651072;visibility:visible;mso-wrap-style:square;mso-width-percent:0;mso-height-percent:0;mso-wrap-distance-left:9pt;mso-wrap-distance-top:0;mso-wrap-distance-right:9pt;mso-wrap-distance-bottom:0;mso-position-horizontal:absolute;mso-position-horizontal-relative:text;mso-position-vertical:absolute;mso-position-vertical-relative:text;mso-width-percent:0;mso-height-percent:0;mso-width-relative:margin;mso-height-relative:margin;v-text-anchor:top" o:gfxdata="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" filled="f" stroked="f">
                 <v:textbox>
                   <w:txbxContent>
                     <w:p>
@@ -3602,7 +3700,7 @@
           </mc:Choice>
           <mc:Fallback>
             <w:pict>
-              <v:shape w14:anchorId="55443CBA" id="Text Box 82" o:spid="_x0000_s1050" type="#_x0000_t202" style="position:absolute;left:0;text-align:left;margin-left:340.75pt;margin-top:-5.6pt;width:197pt;height:28.05pt;z-index:251668480;visibility:visible;mso-wrap-style:square;mso-wrap-distance-left:9pt;mso-wrap-distance-top:0;mso-wrap-distance-right:9pt;mso-wrap-distance-bottom:0;mso-position-horizontal:absolute;mso-position-horizontal-relative:text;mso-position-vertical:absolute;mso-position-vertical-relative:text;v-text-anchor:top" o:gfxdata="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" filled="f" stroked="f">
+              <v:shape w14:anchorId="55443CBA" id="Text Box 82" o:spid="_x0000_s1050" type="#_x0000_t202" style="position:absolute;left:0;text-align:left;margin-left:340.75pt;margin-top:-5.6pt;width:197pt;height:28.05pt;z-index:251668480;visibility:visible;mso-wrap-style:square;mso-wrap-distance-left:9pt;mso-wrap-distance-top:0;mso-wrap-distance-right:9pt;mso-wrap-distance-bottom:0;mso-position-horizontal:absolute;mso-position-horizontal-relative:text;mso-position-vertical:absolute;mso-position-vertical-relative:text;v-text-anchor:top" o:gfxdata="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" filled="f" stroked="f">
                 <v:textbox>
                   <w:txbxContent>
                     <w:p>
@@ -3700,7 +3798,7 @@
           </mc:Choice>
           <mc:Fallback>
             <w:pict>
-              <v:shape w14:anchorId="1EC65615" id="Text Box 81" o:spid="_x0000_s1051" type="#_x0000_t202" style="position:absolute;left:0;text-align:left;margin-left:137.3pt;margin-top:-5.65pt;width:169.5pt;height:28.05pt;z-index:251667456;visibility:visible;mso-wrap-style:square;mso-wrap-distance-left:9pt;mso-wrap-distance-top:0;mso-wrap-distance-right:9pt;mso-wrap-distance-bottom:0;mso-position-horizontal:absolute;mso-position-horizontal-relative:text;mso-position-vertical:absolute;mso-position-vertical-relative:text;v-text-anchor:top" o:gfxdata="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" filled="f" stroked="f">
+              <v:shape w14:anchorId="1EC65615" id="Text Box 81" o:spid="_x0000_s1051" type="#_x0000_t202" style="position:absolute;left:0;text-align:left;margin-left:137.3pt;margin-top:-5.65pt;width:169.5pt;height:28.05pt;z-index:251667456;visibility:visible;mso-wrap-style:square;mso-wrap-distance-left:9pt;mso-wrap-distance-top:0;mso-wrap-distance-right:9pt;mso-wrap-distance-bottom:0;mso-position-horizontal:absolute;mso-position-horizontal-relative:text;mso-position-vertical:absolute;mso-position-vertical-relative:text;v-text-anchor:top" o:gfxdata="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" filled="f" stroked="f">
                 <v:textbox>
                   <w:txbxContent>
                     <w:p>
@@ -3828,7 +3926,7 @@
           </mc:Choice>
           <mc:Fallback>
             <w:pict>
-              <v:shape w14:anchorId="0C1D8E87" id="Text Box 83" o:spid="_x0000_s1052" type="#_x0000_t202" style="position:absolute;margin-left:368.9pt;margin-top:18.55pt;width:188.5pt;height:28.05pt;z-index:251669504;visibility:visible;mso-wrap-style:square;mso-wrap-distance-left:9pt;mso-wrap-distance-top:0;mso-wrap-distance-right:9pt;mso-wrap-distance-bottom:0;mso-position-horizontal:absolute;mso-position-horizontal-relative:text;mso-position-vertical:absolute;mso-position-vertical-relative:text;v-text-anchor:top" o:gfxdata="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" filled="f" stroked="f">
+              <v:shape w14:anchorId="0C1D8E87" id="Text Box 83" o:spid="_x0000_s1052" type="#_x0000_t202" style="position:absolute;margin-left:368.9pt;margin-top:18.55pt;width:188.5pt;height:28.05pt;z-index:251669504;visibility:visible;mso-wrap-style:square;mso-wrap-distance-left:9pt;mso-wrap-distance-top:0;mso-wrap-distance-right:9pt;mso-wrap-distance-bottom:0;mso-position-horizontal:absolute;mso-position-horizontal-relative:text;mso-position-vertical:absolute;mso-position-vertical-relative:text;v-text-anchor:top" o:gfxdata="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" filled="f" stroked="f">
                 <v:textbox>
                   <w:txbxContent>
                     <w:p>
@@ -3939,7 +4037,7 @@
           </mc:Choice>
           <mc:Fallback>
             <w:pict>
-              <v:shape w14:anchorId="1ED4E6BE" id="Text Box 85" o:spid="_x0000_s1053" type="#_x0000_t202" style="position:absolute;margin-left:364.65pt;margin-top:18.25pt;width:188.5pt;height:27.95pt;z-index:251671552;visibility:visible;mso-wrap-style:square;mso-wrap-distance-left:9pt;mso-wrap-distance-top:0;mso-wrap-distance-right:9pt;mso-wrap-distance-bottom:0;mso-position-horizontal:absolute;mso-position-horizontal-relative:text;mso-position-vertical:absolute;mso-position-vertical-relative:text;v-text-anchor:top" o:gfxdata="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" filled="f" stroked="f" strokeweight=".5pt">
+              <v:shape w14:anchorId="1ED4E6BE" id="Text Box 85" o:spid="_x0000_s1053" type="#_x0000_t202" style="position:absolute;margin-left:364.65pt;margin-top:18.25pt;width:188.5pt;height:27.95pt;z-index:251671552;visibility:visible;mso-wrap-style:square;mso-wrap-distance-left:9pt;mso-wrap-distance-top:0;mso-wrap-distance-right:9pt;mso-wrap-distance-bottom:0;mso-position-horizontal:absolute;mso-position-horizontal-relative:text;mso-position-vertical:absolute;mso-position-vertical-relative:text;v-text-anchor:top" o:gfxdata="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" filled="f" stroked="f" strokeweight=".5pt">
                 <v:textbox>
                   <w:txbxContent>
                     <w:p>
@@ -4058,7 +4156,7 @@
           </mc:Choice>
           <mc:Fallback>
             <w:pict>
-              <v:shape w14:anchorId="15D24CCD" id="Text Box 84" o:spid="_x0000_s1054" type="#_x0000_t202" style="position:absolute;margin-left:141.1pt;margin-top:-5pt;width:188.5pt;height:28.05pt;z-index:251670528;visibility:visible;mso-wrap-style:square;mso-wrap-distance-left:9pt;mso-wrap-distance-top:0;mso-wrap-distance-right:9pt;mso-wrap-distance-bottom:0;mso-position-horizontal:absolute;mso-position-horizontal-relative:text;mso-position-vertical:absolute;mso-position-vertical-relative:text;v-text-anchor:top" o:gfxdata="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" filled="f" stroked="f">
+              <v:shape w14:anchorId="15D24CCD" id="Text Box 84" o:spid="_x0000_s1054" type="#_x0000_t202" style="position:absolute;margin-left:141.1pt;margin-top:-5pt;width:188.5pt;height:28.05pt;z-index:251670528;visibility:visible;mso-wrap-style:square;mso-wrap-distance-left:9pt;mso-wrap-distance-top:0;mso-wrap-distance-right:9pt;mso-wrap-distance-bottom:0;mso-position-horizontal:absolute;mso-position-horizontal-relative:text;mso-position-vertical:absolute;mso-position-vertical-relative:text;v-text-anchor:top" o:gfxdata="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" filled="f" stroked="f">
                 <v:textbox>
                   <w:txbxContent>
                     <w:p>
@@ -4148,7 +4246,7 @@
           </mc:Choice>
           <mc:Fallback>
             <w:pict>
-              <v:shape w14:anchorId="03BF6AB4" id="Text Box 86" o:spid="_x0000_s1055" type="#_x0000_t202" style="position:absolute;margin-left:83.35pt;margin-top:18.3pt;width:445.9pt;height:28.05pt;z-index:251672576;visibility:visible;mso-wrap-style:square;mso-wrap-distance-left:9pt;mso-wrap-distance-top:0;mso-wrap-distance-right:9pt;mso-wrap-distance-bottom:0;mso-position-horizontal:absolute;mso-position-horizontal-relative:text;mso-position-vertical:absolute;mso-position-vertical-relative:text;v-text-anchor:top" o:gfxdata="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" filled="f" stroked="f">
+              <v:shape w14:anchorId="03BF6AB4" id="Text Box 86" o:spid="_x0000_s1055" type="#_x0000_t202" style="position:absolute;margin-left:83.35pt;margin-top:18.3pt;width:445.9pt;height:28.05pt;z-index:251672576;visibility:visible;mso-wrap-style:square;mso-wrap-distance-left:9pt;mso-wrap-distance-top:0;mso-wrap-distance-right:9pt;mso-wrap-distance-bottom:0;mso-position-horizontal:absolute;mso-position-horizontal-relative:text;mso-position-vertical:absolute;mso-position-vertical-relative:text;v-text-anchor:top" o:gfxdata="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" filled="f" stroked="f">
                 <v:textbox>
                   <w:txbxContent>
                     <w:p>
@@ -4239,25 +4337,6 @@
     </w:p>
     <w:p>
       <w:pPr>
-        <w:spacing w:line="360" w:lineRule="auto"/>
-        <w:ind w:left="720"/>
-        <w:rPr>
-          <w:rFonts w:ascii="Times New Roman" w:hAnsi="Times New Roman" w:cs="Times New Roman"/>
-          <w:sz w:val="28"/>
-          <w:szCs w:val="28"/>
-        </w:rPr>
-      </w:pPr>
-      <w:r>
-        <w:rPr>
-          <w:rFonts w:ascii="Times New Roman" w:hAnsi="Times New Roman" w:cs="Times New Roman"/>
-          <w:sz w:val="28"/>
-          <w:szCs w:val="28"/>
-        </w:rPr>
-        <w:t>(Mỗi học viên lập 02 phiếu: Phòng Đào tạo lưu 01, Ban chỉ huy Đại đội lưu 01)</w:t>
-      </w:r>
-    </w:p>
-    <w:p>
-      <w:pPr>
         <w:tabs>
           <w:tab w:val="center" w:pos="7670"/>
         </w:tabs>
@@ -4278,156 +4357,15 @@
           <w:szCs w:val="28"/>
         </w:rPr>
         <w:tab/>
-        <w:t>Học viên</w:t>
       </w:r>
       <w:r>
         <w:rPr>
           <w:rFonts w:ascii="Times New Roman" w:hAnsi="Times New Roman" w:cs="Times New Roman"/>
           <w:b/>
-          <w:noProof/>
-          <w:sz w:val="28"/>
-          <w:szCs w:val="28"/>
-        </w:rPr>
-        <mc:AlternateContent>
-          <mc:Choice Requires="wps">
-            <w:drawing>
-              <wp:anchor distT="0" distB="0" distL="114300" distR="114300" simplePos="0" relativeHeight="251641856" behindDoc="0" locked="0" layoutInCell="1" allowOverlap="1" wp14:anchorId="35442578" wp14:editId="125E2B63">
-                <wp:simplePos x="0" y="0"/>
-                <wp:positionH relativeFrom="column">
-                  <wp:posOffset>495300</wp:posOffset>
-                </wp:positionH>
-                <wp:positionV relativeFrom="paragraph">
-                  <wp:posOffset>529590</wp:posOffset>
-                </wp:positionV>
-                <wp:extent cx="2311400" cy="685800"/>
-                <wp:effectExtent l="7620" t="6985" r="5080" b="12065"/>
-                <wp:wrapNone/>
-                <wp:docPr id="1346980077" name="Text Box 49"/>
-                <wp:cNvGraphicFramePr>
-                  <a:graphicFrameLocks xmlns:a="http://schemas.openxmlformats.org/drawingml/2006/main"/>
-                </wp:cNvGraphicFramePr>
-                <a:graphic xmlns:a="http://schemas.openxmlformats.org/drawingml/2006/main">
-                  <a:graphicData uri="http://schemas.microsoft.com/office/word/2010/wordprocessingShape">
-                    <wps:wsp>
-                      <wps:cNvSpPr txBox="1">
-                        <a:spLocks noChangeArrowheads="1"/>
-                      </wps:cNvSpPr>
-                      <wps:spPr bwMode="auto">
-                        <a:xfrm>
-                          <a:off x="0" y="0"/>
-                          <a:ext cx="2311400" cy="685800"/>
-                        </a:xfrm>
-                        <a:prstGeom prst="rect">
-                          <a:avLst/>
-                        </a:prstGeom>
-                        <a:solidFill>
-                          <a:srgbClr val="FFFFFF"/>
-                        </a:solidFill>
-                        <a:ln w="9525">
-                          <a:solidFill>
-                            <a:srgbClr val="000000"/>
-                          </a:solidFill>
-                          <a:miter lim="800000"/>
-                        </a:ln>
-                      </wps:spPr>
-                      <wps:txbx>
-                        <w:txbxContent>
-                          <w:p>
-                            <w:pPr>
-                              <w:jc w:val="center"/>
-                              <w:rPr>
-                                <w:rFonts w:ascii="Times New Roman" w:hAnsi="Times New Roman" w:cs="Times New Roman"/>
-                                <w:sz w:val="24"/>
-                                <w:szCs w:val="24"/>
-                              </w:rPr>
-                            </w:pPr>
-                            <w:r>
-                              <w:rPr>
-                                <w:rFonts w:ascii="Times New Roman" w:hAnsi="Times New Roman" w:cs="Times New Roman"/>
-                                <w:sz w:val="24"/>
-                                <w:szCs w:val="24"/>
-                              </w:rPr>
-                              <w:t>Yêu cầu ghi đầy đủ chính xác.</w:t>
-                            </w:r>
-                          </w:p>
-                          <w:p>
-                            <w:pPr>
-                              <w:jc w:val="center"/>
-                              <w:rPr>
-                                <w:rFonts w:ascii="Times New Roman" w:hAnsi="Times New Roman" w:cs="Times New Roman"/>
-                                <w:b/>
-                                <w:sz w:val="28"/>
-                                <w:szCs w:val="28"/>
-                              </w:rPr>
-                            </w:pPr>
-                            <w:r>
-                              <w:rPr>
-                                <w:rFonts w:ascii="Times New Roman" w:hAnsi="Times New Roman" w:cs="Times New Roman"/>
-                                <w:sz w:val="24"/>
-                                <w:szCs w:val="24"/>
-                              </w:rPr>
-                              <w:t>Phiếu đăng ký học viên là căn cứ để quản lý và cấp bằng tốt nghiệp.</w:t>
-                            </w:r>
-                          </w:p>
-                        </w:txbxContent>
-                      </wps:txbx>
-                      <wps:bodyPr rot="0" vert="horz" wrap="square" lIns="91440" tIns="45720" rIns="91440" bIns="45720" anchor="t" anchorCtr="0" upright="1">
-                        <a:noAutofit/>
-                      </wps:bodyPr>
-                    </wps:wsp>
-                  </a:graphicData>
-                </a:graphic>
-              </wp:anchor>
-            </w:drawing>
-          </mc:Choice>
-          <mc:Fallback>
-            <w:pict>
-              <v:shape w14:anchorId="35442578" id="Text Box 49" o:spid="_x0000_s1056" type="#_x0000_t202" style="position:absolute;left:0;text-align:left;margin-left:39pt;margin-top:41.7pt;width:182pt;height:54pt;z-index:251641856;visibility:visible;mso-wrap-style:square;mso-wrap-distance-left:9pt;mso-wrap-distance-top:0;mso-wrap-distance-right:9pt;mso-wrap-distance-bottom:0;mso-position-horizontal:absolute;mso-position-horizontal-relative:text;mso-position-vertical:absolute;mso-position-vertical-relative:text;v-text-anchor:top" o:gfxdata="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">
-                <v:textbox>
-                  <w:txbxContent>
-                    <w:p>
-                      <w:pPr>
-                        <w:jc w:val="center"/>
-                        <w:rPr>
-                          <w:rFonts w:ascii="Times New Roman" w:hAnsi="Times New Roman" w:cs="Times New Roman"/>
-                          <w:sz w:val="24"/>
-                          <w:szCs w:val="24"/>
-                        </w:rPr>
-                      </w:pPr>
-                      <w:r>
-                        <w:rPr>
-                          <w:rFonts w:ascii="Times New Roman" w:hAnsi="Times New Roman" w:cs="Times New Roman"/>
-                          <w:sz w:val="24"/>
-                          <w:szCs w:val="24"/>
-                        </w:rPr>
-                        <w:t>Yêu cầu ghi đầy đủ chính xác.</w:t>
-                      </w:r>
-                    </w:p>
-                    <w:p>
-                      <w:pPr>
-                        <w:jc w:val="center"/>
-                        <w:rPr>
-                          <w:rFonts w:ascii="Times New Roman" w:hAnsi="Times New Roman" w:cs="Times New Roman"/>
-                          <w:b/>
-                          <w:sz w:val="28"/>
-                          <w:szCs w:val="28"/>
-                        </w:rPr>
-                      </w:pPr>
-                      <w:r>
-                        <w:rPr>
-                          <w:rFonts w:ascii="Times New Roman" w:hAnsi="Times New Roman" w:cs="Times New Roman"/>
-                          <w:sz w:val="24"/>
-                          <w:szCs w:val="24"/>
-                        </w:rPr>
-                        <w:t>Phiếu đăng ký học viên là căn cứ để quản lý và cấp bằng tốt nghiệp.</w:t>
-                      </w:r>
-                    </w:p>
-                  </w:txbxContent>
-                </v:textbox>
-              </v:shape>
-            </w:pict>
-          </mc:Fallback>
-        </mc:AlternateContent>
+          <w:sz w:val="28"/>
+          <w:szCs w:val="28"/>
+        </w:rPr>
+        <w:t>Quân nhân</w:t>
       </w:r>
     </w:p>
     <w:p>
@@ -4534,572 +4472,6 @@
         <w:t>……………………………………….</w:t>
       </w:r>
     </w:p>
-    <w:p>
-      <w:pPr>
-        <w:tabs>
-          <w:tab w:val="center" w:pos="910"/>
-          <w:tab w:val="left" w:pos="5460"/>
-          <w:tab w:val="center" w:pos="5980"/>
-        </w:tabs>
-        <w:spacing w:line="360" w:lineRule="auto"/>
-        <w:ind w:left="720"/>
-        <w:rPr>
-          <w:rFonts w:ascii="Times New Roman" w:hAnsi="Times New Roman" w:cs="Times New Roman"/>
-          <w:b/>
-          <w:sz w:val="28"/>
-          <w:szCs w:val="28"/>
-        </w:rPr>
-      </w:pPr>
-    </w:p>
-    <w:p>
-      <w:pPr>
-        <w:tabs>
-          <w:tab w:val="center" w:pos="910"/>
-          <w:tab w:val="left" w:pos="5460"/>
-          <w:tab w:val="center" w:pos="5980"/>
-        </w:tabs>
-        <w:spacing w:line="360" w:lineRule="auto"/>
-        <w:ind w:left="720"/>
-        <w:jc w:val="center"/>
-        <w:rPr>
-          <w:rFonts w:ascii="Times New Roman" w:hAnsi="Times New Roman" w:cs="Times New Roman"/>
-          <w:b/>
-          <w:sz w:val="28"/>
-          <w:szCs w:val="28"/>
-        </w:rPr>
-      </w:pPr>
-      <w:r>
-        <w:rPr>
-          <w:rFonts w:ascii="Times New Roman" w:hAnsi="Times New Roman" w:cs="Times New Roman"/>
-          <w:b/>
-          <w:sz w:val="28"/>
-          <w:szCs w:val="28"/>
-        </w:rPr>
-        <w:t>KẾT QUẢ HỌC TẬP, RÈN LUYỆN</w:t>
-      </w:r>
-    </w:p>
-    <w:tbl>
-      <w:tblPr>
-        <w:tblW w:w="0" w:type="auto"/>
-        <w:tblInd w:w="720" w:type="dxa"/>
-        <w:tblBorders>
-          <w:top w:val="single" w:sz="4" w:space="0" w:color="auto"/>
-          <w:left w:val="single" w:sz="4" w:space="0" w:color="auto"/>
-          <w:bottom w:val="single" w:sz="4" w:space="0" w:color="auto"/>
-          <w:right w:val="single" w:sz="4" w:space="0" w:color="auto"/>
-          <w:insideH w:val="single" w:sz="4" w:space="0" w:color="auto"/>
-          <w:insideV w:val="single" w:sz="4" w:space="0" w:color="auto"/>
-        </w:tblBorders>
-        <w:tblLook w:val="04A0" w:firstRow="1" w:lastRow="0" w:firstColumn="1" w:lastColumn="0" w:noHBand="0" w:noVBand="1"/>
-      </w:tblPr>
-      <w:tblGrid>
-        <w:gridCol w:w="2433"/>
-        <w:gridCol w:w="2423"/>
-        <w:gridCol w:w="2423"/>
-        <w:gridCol w:w="2424"/>
-      </w:tblGrid>
-      <w:tr>
-        <w:tc>
-          <w:tcPr>
-            <w:tcW w:w="2482" w:type="dxa"/>
-          </w:tcPr>
-          <w:p>
-            <w:pPr>
-              <w:tabs>
-                <w:tab w:val="center" w:pos="910"/>
-                <w:tab w:val="left" w:pos="5460"/>
-                <w:tab w:val="center" w:pos="5980"/>
-              </w:tabs>
-              <w:spacing w:line="360" w:lineRule="auto"/>
-              <w:jc w:val="center"/>
-              <w:rPr>
-                <w:rFonts w:ascii="Times New Roman" w:hAnsi="Times New Roman" w:cs="Times New Roman"/>
-                <w:b/>
-                <w:sz w:val="28"/>
-                <w:szCs w:val="28"/>
-              </w:rPr>
-            </w:pPr>
-          </w:p>
-        </w:tc>
-        <w:tc>
-          <w:tcPr>
-            <w:tcW w:w="2482" w:type="dxa"/>
-          </w:tcPr>
-          <w:p>
-            <w:pPr>
-              <w:tabs>
-                <w:tab w:val="center" w:pos="910"/>
-                <w:tab w:val="left" w:pos="5460"/>
-                <w:tab w:val="center" w:pos="5980"/>
-              </w:tabs>
-              <w:spacing w:line="360" w:lineRule="auto"/>
-              <w:jc w:val="center"/>
-              <w:rPr>
-                <w:rFonts w:ascii="Times New Roman" w:hAnsi="Times New Roman" w:cs="Times New Roman"/>
-                <w:b/>
-                <w:sz w:val="28"/>
-                <w:szCs w:val="28"/>
-              </w:rPr>
-            </w:pPr>
-            <w:r>
-              <w:rPr>
-                <w:rFonts w:ascii="Times New Roman" w:hAnsi="Times New Roman" w:cs="Times New Roman"/>
-                <w:b/>
-                <w:sz w:val="28"/>
-                <w:szCs w:val="28"/>
-              </w:rPr>
-              <w:t>Học kỳ I</w:t>
-            </w:r>
-          </w:p>
-        </w:tc>
-        <w:tc>
-          <w:tcPr>
-            <w:tcW w:w="2482" w:type="dxa"/>
-          </w:tcPr>
-          <w:p>
-            <w:pPr>
-              <w:tabs>
-                <w:tab w:val="center" w:pos="910"/>
-                <w:tab w:val="left" w:pos="5460"/>
-                <w:tab w:val="center" w:pos="5980"/>
-              </w:tabs>
-              <w:spacing w:line="360" w:lineRule="auto"/>
-              <w:jc w:val="center"/>
-              <w:rPr>
-                <w:rFonts w:ascii="Times New Roman" w:hAnsi="Times New Roman" w:cs="Times New Roman"/>
-                <w:b/>
-                <w:sz w:val="28"/>
-                <w:szCs w:val="28"/>
-              </w:rPr>
-            </w:pPr>
-            <w:r>
-              <w:rPr>
-                <w:rFonts w:ascii="Times New Roman" w:hAnsi="Times New Roman" w:cs="Times New Roman"/>
-                <w:b/>
-                <w:sz w:val="28"/>
-                <w:szCs w:val="28"/>
-              </w:rPr>
-              <w:t>Học kỳ II</w:t>
-            </w:r>
-          </w:p>
-        </w:tc>
-        <w:tc>
-          <w:tcPr>
-            <w:tcW w:w="2483" w:type="dxa"/>
-          </w:tcPr>
-          <w:p>
-            <w:pPr>
-              <w:tabs>
-                <w:tab w:val="center" w:pos="910"/>
-                <w:tab w:val="left" w:pos="5460"/>
-                <w:tab w:val="center" w:pos="5980"/>
-              </w:tabs>
-              <w:spacing w:line="360" w:lineRule="auto"/>
-              <w:jc w:val="center"/>
-              <w:rPr>
-                <w:rFonts w:ascii="Times New Roman" w:hAnsi="Times New Roman" w:cs="Times New Roman"/>
-                <w:b/>
-                <w:sz w:val="28"/>
-                <w:szCs w:val="28"/>
-              </w:rPr>
-            </w:pPr>
-            <w:r>
-              <w:rPr>
-                <w:rFonts w:ascii="Times New Roman" w:hAnsi="Times New Roman" w:cs="Times New Roman"/>
-                <w:b/>
-                <w:sz w:val="28"/>
-                <w:szCs w:val="28"/>
-              </w:rPr>
-              <w:t>Học Kỳ III</w:t>
-            </w:r>
-          </w:p>
-        </w:tc>
-      </w:tr>
-      <w:tr>
-        <w:tc>
-          <w:tcPr>
-            <w:tcW w:w="2482" w:type="dxa"/>
-            <w:vAlign w:val="center"/>
-          </w:tcPr>
-          <w:p>
-            <w:pPr>
-              <w:tabs>
-                <w:tab w:val="center" w:pos="910"/>
-                <w:tab w:val="left" w:pos="5460"/>
-                <w:tab w:val="center" w:pos="5980"/>
-              </w:tabs>
-              <w:rPr>
-                <w:rFonts w:ascii="Times New Roman" w:hAnsi="Times New Roman" w:cs="Times New Roman"/>
-                <w:sz w:val="28"/>
-                <w:szCs w:val="28"/>
-              </w:rPr>
-            </w:pPr>
-            <w:r>
-              <w:rPr>
-                <w:rFonts w:ascii="Times New Roman" w:hAnsi="Times New Roman" w:cs="Times New Roman"/>
-                <w:sz w:val="28"/>
-                <w:szCs w:val="28"/>
-              </w:rPr>
-              <w:t>Kết quả học tập</w:t>
-            </w:r>
-          </w:p>
-        </w:tc>
-        <w:tc>
-          <w:tcPr>
-            <w:tcW w:w="2482" w:type="dxa"/>
-          </w:tcPr>
-          <w:p>
-            <w:pPr>
-              <w:tabs>
-                <w:tab w:val="center" w:pos="910"/>
-                <w:tab w:val="left" w:pos="5460"/>
-                <w:tab w:val="center" w:pos="5980"/>
-              </w:tabs>
-              <w:spacing w:line="360" w:lineRule="auto"/>
-              <w:jc w:val="center"/>
-              <w:rPr>
-                <w:rFonts w:ascii="Times New Roman" w:hAnsi="Times New Roman" w:cs="Times New Roman"/>
-                <w:b/>
-                <w:sz w:val="28"/>
-                <w:szCs w:val="28"/>
-              </w:rPr>
-            </w:pPr>
-          </w:p>
-        </w:tc>
-        <w:tc>
-          <w:tcPr>
-            <w:tcW w:w="2482" w:type="dxa"/>
-          </w:tcPr>
-          <w:p>
-            <w:pPr>
-              <w:tabs>
-                <w:tab w:val="center" w:pos="910"/>
-                <w:tab w:val="left" w:pos="5460"/>
-                <w:tab w:val="center" w:pos="5980"/>
-              </w:tabs>
-              <w:spacing w:line="360" w:lineRule="auto"/>
-              <w:jc w:val="center"/>
-              <w:rPr>
-                <w:rFonts w:ascii="Times New Roman" w:hAnsi="Times New Roman" w:cs="Times New Roman"/>
-                <w:b/>
-                <w:sz w:val="28"/>
-                <w:szCs w:val="28"/>
-              </w:rPr>
-            </w:pPr>
-          </w:p>
-        </w:tc>
-        <w:tc>
-          <w:tcPr>
-            <w:tcW w:w="2483" w:type="dxa"/>
-          </w:tcPr>
-          <w:p>
-            <w:pPr>
-              <w:tabs>
-                <w:tab w:val="center" w:pos="910"/>
-                <w:tab w:val="left" w:pos="5460"/>
-                <w:tab w:val="center" w:pos="5980"/>
-              </w:tabs>
-              <w:spacing w:line="360" w:lineRule="auto"/>
-              <w:jc w:val="center"/>
-              <w:rPr>
-                <w:rFonts w:ascii="Times New Roman" w:hAnsi="Times New Roman" w:cs="Times New Roman"/>
-                <w:b/>
-                <w:sz w:val="28"/>
-                <w:szCs w:val="28"/>
-              </w:rPr>
-            </w:pPr>
-          </w:p>
-        </w:tc>
-      </w:tr>
-      <w:tr>
-        <w:tc>
-          <w:tcPr>
-            <w:tcW w:w="2482" w:type="dxa"/>
-            <w:vAlign w:val="center"/>
-          </w:tcPr>
-          <w:p>
-            <w:pPr>
-              <w:tabs>
-                <w:tab w:val="center" w:pos="910"/>
-                <w:tab w:val="left" w:pos="5460"/>
-                <w:tab w:val="center" w:pos="5980"/>
-              </w:tabs>
-              <w:rPr>
-                <w:rFonts w:ascii="Times New Roman" w:hAnsi="Times New Roman" w:cs="Times New Roman"/>
-                <w:sz w:val="28"/>
-                <w:szCs w:val="28"/>
-              </w:rPr>
-            </w:pPr>
-            <w:r>
-              <w:rPr>
-                <w:rFonts w:ascii="Times New Roman" w:hAnsi="Times New Roman" w:cs="Times New Roman"/>
-                <w:sz w:val="28"/>
-                <w:szCs w:val="28"/>
-              </w:rPr>
-              <w:t>Kết quả rèn luyện</w:t>
-            </w:r>
-          </w:p>
-        </w:tc>
-        <w:tc>
-          <w:tcPr>
-            <w:tcW w:w="2482" w:type="dxa"/>
-          </w:tcPr>
-          <w:p>
-            <w:pPr>
-              <w:tabs>
-                <w:tab w:val="center" w:pos="910"/>
-                <w:tab w:val="left" w:pos="5460"/>
-                <w:tab w:val="center" w:pos="5980"/>
-              </w:tabs>
-              <w:spacing w:line="360" w:lineRule="auto"/>
-              <w:jc w:val="center"/>
-              <w:rPr>
-                <w:rFonts w:ascii="Times New Roman" w:hAnsi="Times New Roman" w:cs="Times New Roman"/>
-                <w:b/>
-                <w:sz w:val="28"/>
-                <w:szCs w:val="28"/>
-              </w:rPr>
-            </w:pPr>
-          </w:p>
-        </w:tc>
-        <w:tc>
-          <w:tcPr>
-            <w:tcW w:w="2482" w:type="dxa"/>
-          </w:tcPr>
-          <w:p>
-            <w:pPr>
-              <w:tabs>
-                <w:tab w:val="center" w:pos="910"/>
-                <w:tab w:val="left" w:pos="5460"/>
-                <w:tab w:val="center" w:pos="5980"/>
-              </w:tabs>
-              <w:spacing w:line="360" w:lineRule="auto"/>
-              <w:jc w:val="center"/>
-              <w:rPr>
-                <w:rFonts w:ascii="Times New Roman" w:hAnsi="Times New Roman" w:cs="Times New Roman"/>
-                <w:b/>
-                <w:sz w:val="28"/>
-                <w:szCs w:val="28"/>
-              </w:rPr>
-            </w:pPr>
-          </w:p>
-        </w:tc>
-        <w:tc>
-          <w:tcPr>
-            <w:tcW w:w="2483" w:type="dxa"/>
-          </w:tcPr>
-          <w:p>
-            <w:pPr>
-              <w:tabs>
-                <w:tab w:val="center" w:pos="910"/>
-                <w:tab w:val="left" w:pos="5460"/>
-                <w:tab w:val="center" w:pos="5980"/>
-              </w:tabs>
-              <w:spacing w:line="360" w:lineRule="auto"/>
-              <w:jc w:val="center"/>
-              <w:rPr>
-                <w:rFonts w:ascii="Times New Roman" w:hAnsi="Times New Roman" w:cs="Times New Roman"/>
-                <w:b/>
-                <w:sz w:val="28"/>
-                <w:szCs w:val="28"/>
-              </w:rPr>
-            </w:pPr>
-          </w:p>
-        </w:tc>
-      </w:tr>
-      <w:tr>
-        <w:tc>
-          <w:tcPr>
-            <w:tcW w:w="2482" w:type="dxa"/>
-            <w:vAlign w:val="center"/>
-          </w:tcPr>
-          <w:p>
-            <w:pPr>
-              <w:tabs>
-                <w:tab w:val="center" w:pos="910"/>
-                <w:tab w:val="left" w:pos="5460"/>
-                <w:tab w:val="center" w:pos="5980"/>
-              </w:tabs>
-              <w:rPr>
-                <w:rFonts w:ascii="Times New Roman" w:hAnsi="Times New Roman" w:cs="Times New Roman"/>
-                <w:sz w:val="28"/>
-                <w:szCs w:val="28"/>
-              </w:rPr>
-            </w:pPr>
-            <w:r>
-              <w:rPr>
-                <w:rFonts w:ascii="Times New Roman" w:hAnsi="Times New Roman" w:cs="Times New Roman"/>
-                <w:sz w:val="28"/>
-                <w:szCs w:val="28"/>
-              </w:rPr>
-              <w:t>Khen thưởng</w:t>
-            </w:r>
-          </w:p>
-        </w:tc>
-        <w:tc>
-          <w:tcPr>
-            <w:tcW w:w="2482" w:type="dxa"/>
-          </w:tcPr>
-          <w:p>
-            <w:pPr>
-              <w:tabs>
-                <w:tab w:val="center" w:pos="910"/>
-                <w:tab w:val="left" w:pos="5460"/>
-                <w:tab w:val="center" w:pos="5980"/>
-              </w:tabs>
-              <w:spacing w:line="360" w:lineRule="auto"/>
-              <w:jc w:val="center"/>
-              <w:rPr>
-                <w:rFonts w:ascii="Times New Roman" w:hAnsi="Times New Roman" w:cs="Times New Roman"/>
-                <w:b/>
-                <w:sz w:val="28"/>
-                <w:szCs w:val="28"/>
-              </w:rPr>
-            </w:pPr>
-          </w:p>
-        </w:tc>
-        <w:tc>
-          <w:tcPr>
-            <w:tcW w:w="2482" w:type="dxa"/>
-          </w:tcPr>
-          <w:p>
-            <w:pPr>
-              <w:tabs>
-                <w:tab w:val="center" w:pos="910"/>
-                <w:tab w:val="left" w:pos="5460"/>
-                <w:tab w:val="center" w:pos="5980"/>
-              </w:tabs>
-              <w:spacing w:line="360" w:lineRule="auto"/>
-              <w:jc w:val="center"/>
-              <w:rPr>
-                <w:rFonts w:ascii="Times New Roman" w:hAnsi="Times New Roman" w:cs="Times New Roman"/>
-                <w:b/>
-                <w:sz w:val="28"/>
-                <w:szCs w:val="28"/>
-              </w:rPr>
-            </w:pPr>
-          </w:p>
-        </w:tc>
-        <w:tc>
-          <w:tcPr>
-            <w:tcW w:w="2483" w:type="dxa"/>
-          </w:tcPr>
-          <w:p>
-            <w:pPr>
-              <w:tabs>
-                <w:tab w:val="center" w:pos="910"/>
-                <w:tab w:val="left" w:pos="5460"/>
-                <w:tab w:val="center" w:pos="5980"/>
-              </w:tabs>
-              <w:spacing w:line="360" w:lineRule="auto"/>
-              <w:jc w:val="center"/>
-              <w:rPr>
-                <w:rFonts w:ascii="Times New Roman" w:hAnsi="Times New Roman" w:cs="Times New Roman"/>
-                <w:b/>
-                <w:sz w:val="28"/>
-                <w:szCs w:val="28"/>
-              </w:rPr>
-            </w:pPr>
-          </w:p>
-        </w:tc>
-      </w:tr>
-      <w:tr>
-        <w:tc>
-          <w:tcPr>
-            <w:tcW w:w="2482" w:type="dxa"/>
-            <w:vAlign w:val="center"/>
-          </w:tcPr>
-          <w:p>
-            <w:pPr>
-              <w:tabs>
-                <w:tab w:val="center" w:pos="910"/>
-                <w:tab w:val="left" w:pos="5460"/>
-                <w:tab w:val="center" w:pos="5980"/>
-              </w:tabs>
-              <w:rPr>
-                <w:rFonts w:ascii="Times New Roman" w:hAnsi="Times New Roman" w:cs="Times New Roman"/>
-                <w:sz w:val="28"/>
-                <w:szCs w:val="28"/>
-              </w:rPr>
-            </w:pPr>
-            <w:r>
-              <w:rPr>
-                <w:rFonts w:ascii="Times New Roman" w:hAnsi="Times New Roman" w:cs="Times New Roman"/>
-                <w:sz w:val="28"/>
-                <w:szCs w:val="28"/>
-              </w:rPr>
-              <w:t>Kỷ luật</w:t>
-            </w:r>
-          </w:p>
-        </w:tc>
-        <w:tc>
-          <w:tcPr>
-            <w:tcW w:w="2482" w:type="dxa"/>
-          </w:tcPr>
-          <w:p>
-            <w:pPr>
-              <w:tabs>
-                <w:tab w:val="center" w:pos="910"/>
-                <w:tab w:val="left" w:pos="5460"/>
-                <w:tab w:val="center" w:pos="5980"/>
-              </w:tabs>
-              <w:spacing w:line="360" w:lineRule="auto"/>
-              <w:jc w:val="center"/>
-              <w:rPr>
-                <w:rFonts w:ascii="Times New Roman" w:hAnsi="Times New Roman" w:cs="Times New Roman"/>
-                <w:b/>
-                <w:sz w:val="28"/>
-                <w:szCs w:val="28"/>
-              </w:rPr>
-            </w:pPr>
-          </w:p>
-        </w:tc>
-        <w:tc>
-          <w:tcPr>
-            <w:tcW w:w="2482" w:type="dxa"/>
-          </w:tcPr>
-          <w:p>
-            <w:pPr>
-              <w:tabs>
-                <w:tab w:val="center" w:pos="910"/>
-                <w:tab w:val="left" w:pos="5460"/>
-                <w:tab w:val="center" w:pos="5980"/>
-              </w:tabs>
-              <w:spacing w:line="360" w:lineRule="auto"/>
-              <w:jc w:val="center"/>
-              <w:rPr>
-                <w:rFonts w:ascii="Times New Roman" w:hAnsi="Times New Roman" w:cs="Times New Roman"/>
-                <w:b/>
-                <w:sz w:val="28"/>
-                <w:szCs w:val="28"/>
-              </w:rPr>
-            </w:pPr>
-          </w:p>
-        </w:tc>
-        <w:tc>
-          <w:tcPr>
-            <w:tcW w:w="2483" w:type="dxa"/>
-          </w:tcPr>
-          <w:p>
-            <w:pPr>
-              <w:tabs>
-                <w:tab w:val="center" w:pos="910"/>
-                <w:tab w:val="left" w:pos="5460"/>
-                <w:tab w:val="center" w:pos="5980"/>
-              </w:tabs>
-              <w:spacing w:line="360" w:lineRule="auto"/>
-              <w:jc w:val="center"/>
-              <w:rPr>
-                <w:rFonts w:ascii="Times New Roman" w:hAnsi="Times New Roman" w:cs="Times New Roman"/>
-                <w:b/>
-                <w:sz w:val="28"/>
-                <w:szCs w:val="28"/>
-              </w:rPr>
-            </w:pPr>
-          </w:p>
-        </w:tc>
-      </w:tr>
-    </w:tbl>
     <w:p>
       <w:pPr>
         <w:tabs>
@@ -5292,7 +4664,7 @@
           </mc:Choice>
           <mc:Fallback>
             <w:pict>
-              <v:shape w14:anchorId="41B330AF" id="Text Box 2" o:spid="_x0000_s1057" type="#_x0000_t202" style="position:absolute;margin-left:-28.9pt;margin-top:1.7pt;width:597pt;height:38pt;z-index:251674624;visibility:visible;mso-wrap-style:square;mso-wrap-distance-left:9pt;mso-wrap-distance-top:0;mso-wrap-distance-right:9pt;mso-wrap-distance-bottom:0;mso-position-horizontal:absolute;mso-position-horizontal-relative:text;mso-position-vertical:absolute;mso-position-vertical-relative:text;v-text-anchor:top" o:gfxdata="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" filled="f" stroked="f" strokeweight=".5pt">
+              <v:shape w14:anchorId="41B330AF" id="Text Box 2" o:spid="_x0000_s1056" type="#_x0000_t202" style="position:absolute;margin-left:-28.9pt;margin-top:1.7pt;width:597pt;height:38pt;z-index:251674624;visibility:visible;mso-wrap-style:square;mso-wrap-distance-left:9pt;mso-wrap-distance-top:0;mso-wrap-distance-right:9pt;mso-wrap-distance-bottom:0;mso-position-horizontal:absolute;mso-position-horizontal-relative:text;mso-position-vertical:absolute;mso-position-vertical-relative:text;v-text-anchor:top" o:gfxdata="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" filled="f" stroked="f" strokeweight=".5pt">
                 <v:textbox>
                   <w:txbxContent>
                     <w:p>
@@ -5437,7 +4809,7 @@
           </mc:Choice>
           <mc:Fallback>
             <w:pict>
-              <v:shape w14:anchorId="73EB3A91" id="Text Box 88" o:spid="_x0000_s1058" type="#_x0000_t202" style="position:absolute;margin-left:-28.85pt;margin-top:71.1pt;width:596.95pt;height:89.2pt;z-index:251673600;visibility:visible;mso-wrap-style:square;mso-wrap-distance-left:9pt;mso-wrap-distance-top:0;mso-wrap-distance-right:9pt;mso-wrap-distance-bottom:0;mso-position-horizontal:absolute;mso-position-horizontal-relative:text;mso-position-vertical:absolute;mso-position-vertical-relative:text;v-text-anchor:top" o:gfxdata="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" filled="f" stroked="f">
+              <v:shape w14:anchorId="73EB3A91" id="Text Box 88" o:spid="_x0000_s1057" type="#_x0000_t202" style="position:absolute;margin-left:-28.85pt;margin-top:71.1pt;width:596.95pt;height:89.2pt;z-index:251673600;visibility:visible;mso-wrap-style:square;mso-wrap-distance-left:9pt;mso-wrap-distance-top:0;mso-wrap-distance-right:9pt;mso-wrap-distance-bottom:0;mso-position-horizontal:absolute;mso-position-horizontal-relative:text;mso-position-vertical:absolute;mso-position-vertical-relative:text;v-text-anchor:top" o:gfxdata="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" filled="f" stroked="f">
                 <v:textbox>
                   <w:txbxContent>
                     <w:p>
@@ -5513,7 +4885,7 @@
 </file>
 
 <file path=word/styles.xml><?xml version="1.0" encoding="utf-8"?>
-<w:styles xmlns:mc="http://schemas.openxmlformats.org/markup-compatibility/2006" xmlns:r="http://schemas.openxmlformats.org/officeDocument/2006/relationships" xmlns:w="http://schemas.openxmlformats.org/wordprocessingml/2006/main" xmlns:w14="http://schemas.microsoft.com/office/word/2010/wordml" xmlns:w15="http://schemas.microsoft.com/office/word/2012/wordml" xmlns:w16cex="http://schemas.microsoft.com/office/word/2018/wordml/cex" xmlns:w16cid="http://schemas.microsoft.com/office/word/2016/wordml/cid" xmlns:w16="http://schemas.microsoft.com/office/word/2018/wordml" xmlns:w16du="http://schemas.microsoft.com/office/word/2023/wordml/word16du" xmlns:w16sdtdh="http://schemas.microsoft.com/office/word/2020/wordml/sdtdatahash" xmlns:w16sdtfl="http://schemas.microsoft.com/office/word/2024/wordml/sdtformatlock" xmlns:w16se="http://schemas.microsoft.com/office/word/2015/wordml/symex" mc:Ignorable="w14 w15 w16se w16cid w16 w16cex w16sdtdh w16sdtfl w16du">
+<w:styles xmlns:mc="http://schemas.openxmlformats.org/markup-compatibility/2006" xmlns:r="http://schemas.openxmlformats.org/officeDocument/2006/relationships" xmlns:w="http://schemas.openxmlformats.org/wordprocessingml/2006/main" xmlns:w14="http://schemas.microsoft.com/office/word/2010/wordml" xmlns:w15="http://schemas.microsoft.com/office/word/2012/wordml" xmlns:w16cid="http://schemas.microsoft.com/office/word/2016/wordml/cid" xmlns:w16se="http://schemas.microsoft.com/office/word/2015/wordml/symex" mc:Ignorable="w14 w15 w16se w16cid">
   <w:docDefaults>
     <w:rPrDefault>
       <w:rPr>
@@ -5523,7 +4895,7 @@
     </w:rPrDefault>
     <w:pPrDefault/>
   </w:docDefaults>
-  <w:latentStyles w:defLockedState="0" w:defUIPriority="0" w:defSemiHidden="0" w:defUnhideWhenUsed="0" w:defQFormat="0" w:count="376">
+  <w:latentStyles w:defLockedState="0" w:defUIPriority="0" w:defSemiHidden="0" w:defUnhideWhenUsed="0" w:defQFormat="0" w:count="375">
     <w:lsdException w:name="Normal" w:qFormat="1"/>
     <w:lsdException w:name="heading 1" w:qFormat="1"/>
     <w:lsdException w:name="heading 2" w:semiHidden="1" w:unhideWhenUsed="1" w:qFormat="1"/>
@@ -5811,7 +5183,6 @@
     <w:lsdException w:name="Smart Hyperlink" w:semiHidden="1" w:uiPriority="99" w:unhideWhenUsed="1"/>
     <w:lsdException w:name="Hashtag" w:semiHidden="1" w:uiPriority="99" w:unhideWhenUsed="1"/>
     <w:lsdException w:name="Unresolved Mention" w:semiHidden="1" w:uiPriority="99" w:unhideWhenUsed="1"/>
-    <w:lsdException w:name="Smart Link" w:semiHidden="1" w:uiPriority="99" w:unhideWhenUsed="1"/>
   </w:latentStyles>
   <w:style w:type="paragraph" w:default="1" w:styleId="Normal">
     <w:name w:val="Normal"/>
@@ -6136,10 +5507,6 @@
 </file>
 
 <file path=customXml/item1.xml><?xml version="1.0" encoding="utf-8"?>
-<b:Sources xmlns:b="http://schemas.openxmlformats.org/officeDocument/2006/bibliography" xmlns="http://schemas.openxmlformats.org/officeDocument/2006/bibliography" SelectedStyle="\APASixthEditionOfficeOnline.xsl" StyleName="APA" Version="6"/>
-</file>
-
-<file path=customXml/item2.xml><?xml version="1.0" encoding="utf-8"?>
 <s:customData xmlns="http://www.wps.cn/officeDocument/2013/wpsCustomData" xmlns:s="http://www.wps.cn/officeDocument/2013/wpsCustomData">
   <customSectProps/>
   <customShpExts>
@@ -6148,18 +5515,22 @@
 </s:customData>
 </file>
 
+<file path=customXml/item2.xml><?xml version="1.0" encoding="utf-8"?>
+<b:Sources xmlns:b="http://schemas.openxmlformats.org/officeDocument/2006/bibliography" xmlns="http://schemas.openxmlformats.org/officeDocument/2006/bibliography" SelectedStyle="\APASixthEditionOfficeOnline.xsl" StyleName="APA" Version="6"/>
+</file>
+
 <file path=customXml/itemProps1.xml><?xml version="1.0" encoding="utf-8"?>
-<ds:datastoreItem xmlns:ds="http://schemas.openxmlformats.org/officeDocument/2006/customXml" ds:itemID="{3A2A2460-6C51-4D37-9561-9BB4ED8A0092}">
+<ds:datastoreItem xmlns:ds="http://schemas.openxmlformats.org/officeDocument/2006/customXml" ds:itemID="{B1977F7D-205B-4081-913C-38D41E755F92}">
   <ds:schemaRefs>
-    <ds:schemaRef ds:uri="http://schemas.openxmlformats.org/officeDocument/2006/bibliography"/>
+    <ds:schemaRef ds:uri="http://www.wps.cn/officeDocument/2013/wpsCustomData"/>
   </ds:schemaRefs>
 </ds:datastoreItem>
 </file>
 
 <file path=customXml/itemProps2.xml><?xml version="1.0" encoding="utf-8"?>
-<ds:datastoreItem xmlns:ds="http://schemas.openxmlformats.org/officeDocument/2006/customXml" ds:itemID="{B1977F7D-205B-4081-913C-38D41E755F92}">
+<ds:datastoreItem xmlns:ds="http://schemas.openxmlformats.org/officeDocument/2006/customXml" ds:itemID="{D6EA1686-9CC7-4A06-B2C1-33535D9FB40E}">
   <ds:schemaRefs>
-    <ds:schemaRef ds:uri="http://www.wps.cn/officeDocument/2013/wpsCustomData"/>
+    <ds:schemaRef ds:uri="http://schemas.openxmlformats.org/officeDocument/2006/bibliography"/>
   </ds:schemaRefs>
 </ds:datastoreItem>
 </file>
</xml_diff>